<commit_message>
Expand Experiment 2/3/4 quiz PDFs to ~6 pages
Rebuilt the condensed Experiment 2, 3 and 4 quiz solutions at a comfortable
6-page length (previously too compressed at 2 pages). Each PDF now includes
longer bullet-point conceptual answers, more intermediate numerical steps,
material-selection notes and design checks, with the final answers in
highlighted boxes. All original questions kept. docx + PDF.

Co-Authored-By: Claude Opus 4.7 <noreply@anthropic.com>
Claude-Session: https://claude.ai/code/session_01REYoacDfMmcfn4tpcBCmyb
</commit_message>
<xml_diff>
--- a/PBL_AM/DM_Experiments/Experiment_2_Quiz_Short.docx
+++ b/PBL_AM/DM_Experiments/Experiment_2_Quiz_Short.docx
@@ -22,9 +22,9 @@
           <w:tcPr>
             <w:shd w:fill="1F3864" w:color="auto" w:val="clear"/>
             <w:tcMar>
-              <w:top w:type="dxa" w:w="140"/>
+              <w:top w:type="dxa" w:w="160"/>
               <w:left w:type="dxa" w:w="200"/>
-              <w:bottom w:type="dxa" w:w="140"/>
+              <w:bottom w:type="dxa" w:w="160"/>
               <w:right w:type="dxa" w:w="200"/>
             </w:tcMar>
           </w:tcPr>
@@ -63,7 +63,7 @@
                 <w:sz w:val="17"/>
                 <w:szCs w:val="17"/>
               </w:rPr>
-              <w:t xml:space="preserve">Design of Mechanisms (BE05000341)  ·  Quiz — Short Answers</w:t>
+              <w:t xml:space="preserve">Design of Mechanisms (BE05000341)  ·  Quiz Solutions</w:t>
             </w:r>
           </w:p>
         </w:tc>
@@ -71,13 +71,13 @@
     </w:tbl>
     <w:p>
       <w:pPr>
-        <w:spacing w:after="100" w:before="0"/>
+        <w:spacing w:after="140" w:before="0"/>
       </w:pPr>
     </w:p>
     <w:p>
       <w:pPr>
         <w:keepNext/>
-        <w:spacing w:after="40" w:before="160" w:line="276" w:lineRule="auto"/>
+        <w:spacing w:after="60" w:before="260" w:line="276" w:lineRule="auto"/>
       </w:pPr>
       <w:r>
         <w:rPr>
@@ -107,7 +107,7 @@
     </w:p>
     <w:p>
       <w:pPr>
-        <w:spacing w:after="60" w:before="0" w:line="276" w:lineRule="auto"/>
+        <w:spacing w:after="150" w:before="0" w:line="340" w:lineRule="auto"/>
         <w:ind w:left="140"/>
       </w:pPr>
       <w:r>
@@ -120,13 +120,319 @@
           <w:sz w:val="21"/>
           <w:szCs w:val="21"/>
         </w:rPr>
-        <w:t xml:space="preserve">Forging aligns the grain along the hook shape, closes porosity and gives better fatigue, impact and tensile strength. A forged hook also fails by yielding (gives warning), whereas a cast hook can fail suddenly, so forged hooks are safer for lifting loads.</w:t>
+        <w:t xml:space="preserve">A crane hook lifts heavy, often shock-type loads and its failure can injure people, so it must be made by a process that gives the maximum strength, reliability and a visible warning before failure. Forging is chosen over casting for the following main reasons:</w:t>
+      </w:r>
+    </w:p>
+    <w:p>
+      <w:pPr>
+        <w:spacing w:after="60" w:before="60" w:line="320" w:lineRule="auto"/>
+        <w:ind w:left="480" w:hanging="200"/>
+      </w:pPr>
+      <w:r>
+        <w:rPr>
+          <w:rFonts w:ascii="Calibri" w:cs="Calibri" w:eastAsia="Calibri" w:hAnsi="Calibri"/>
+          <w:b/>
+          <w:bCs/>
+          <w:i w:val="false"/>
+          <w:iCs w:val="false"/>
+          <w:color w:val="1F3864"/>
+          <w:sz w:val="21"/>
+          <w:szCs w:val="21"/>
+        </w:rPr>
+        <w:t xml:space="preserve">• </w:t>
+      </w:r>
+      <w:r>
+        <w:rPr>
+          <w:rFonts w:ascii="Calibri" w:cs="Calibri" w:eastAsia="Calibri" w:hAnsi="Calibri"/>
+          <w:b/>
+          <w:bCs/>
+          <w:i w:val="false"/>
+          <w:iCs w:val="false"/>
+          <w:sz w:val="21"/>
+          <w:szCs w:val="21"/>
+        </w:rPr>
+        <w:t xml:space="preserve">Grain flow follows the shape.</w:t>
+      </w:r>
+      <w:r>
+        <w:rPr>
+          <w:rFonts w:ascii="Calibri" w:cs="Calibri" w:eastAsia="Calibri" w:hAnsi="Calibri"/>
+          <w:b w:val="false"/>
+          <w:bCs w:val="false"/>
+          <w:i w:val="false"/>
+          <w:iCs w:val="false"/>
+          <w:sz w:val="21"/>
+          <w:szCs w:val="21"/>
+        </w:rPr>
+        <w:t xml:space="preserve"> During forging, the metal grains are squeezed and aligned along the shape of the hook, which gives high strength and toughness exactly where the stress acts (at the inner fibre of the trapezoidal cross-section where tensile stress is maximum).</w:t>
+      </w:r>
+    </w:p>
+    <w:p>
+      <w:pPr>
+        <w:spacing w:after="60" w:before="60" w:line="320" w:lineRule="auto"/>
+        <w:ind w:left="480" w:hanging="200"/>
+      </w:pPr>
+      <w:r>
+        <w:rPr>
+          <w:rFonts w:ascii="Calibri" w:cs="Calibri" w:eastAsia="Calibri" w:hAnsi="Calibri"/>
+          <w:b/>
+          <w:bCs/>
+          <w:i w:val="false"/>
+          <w:iCs w:val="false"/>
+          <w:color w:val="1F3864"/>
+          <w:sz w:val="21"/>
+          <w:szCs w:val="21"/>
+        </w:rPr>
+        <w:t xml:space="preserve">• </w:t>
+      </w:r>
+      <w:r>
+        <w:rPr>
+          <w:rFonts w:ascii="Calibri" w:cs="Calibri" w:eastAsia="Calibri" w:hAnsi="Calibri"/>
+          <w:b/>
+          <w:bCs/>
+          <w:i w:val="false"/>
+          <w:iCs w:val="false"/>
+          <w:sz w:val="21"/>
+          <w:szCs w:val="21"/>
+        </w:rPr>
+        <w:t xml:space="preserve">No internal defects.</w:t>
+      </w:r>
+      <w:r>
+        <w:rPr>
+          <w:rFonts w:ascii="Calibri" w:cs="Calibri" w:eastAsia="Calibri" w:hAnsi="Calibri"/>
+          <w:b w:val="false"/>
+          <w:bCs w:val="false"/>
+          <w:i w:val="false"/>
+          <w:iCs w:val="false"/>
+          <w:sz w:val="21"/>
+          <w:szCs w:val="21"/>
+        </w:rPr>
+        <w:t xml:space="preserve"> Forging closes up blow-holes, porosity and shrinkage cavities that are common in castings and act as hidden crack-starters under cyclic load.</w:t>
+      </w:r>
+    </w:p>
+    <w:p>
+      <w:pPr>
+        <w:spacing w:after="60" w:before="60" w:line="320" w:lineRule="auto"/>
+        <w:ind w:left="480" w:hanging="200"/>
+      </w:pPr>
+      <w:r>
+        <w:rPr>
+          <w:rFonts w:ascii="Calibri" w:cs="Calibri" w:eastAsia="Calibri" w:hAnsi="Calibri"/>
+          <w:b/>
+          <w:bCs/>
+          <w:i w:val="false"/>
+          <w:iCs w:val="false"/>
+          <w:color w:val="1F3864"/>
+          <w:sz w:val="21"/>
+          <w:szCs w:val="21"/>
+        </w:rPr>
+        <w:t xml:space="preserve">• </w:t>
+      </w:r>
+      <w:r>
+        <w:rPr>
+          <w:rFonts w:ascii="Calibri" w:cs="Calibri" w:eastAsia="Calibri" w:hAnsi="Calibri"/>
+          <w:b/>
+          <w:bCs/>
+          <w:i w:val="false"/>
+          <w:iCs w:val="false"/>
+          <w:sz w:val="21"/>
+          <w:szCs w:val="21"/>
+        </w:rPr>
+        <w:t xml:space="preserve">Better fatigue and impact resistance.</w:t>
+      </w:r>
+      <w:r>
+        <w:rPr>
+          <w:rFonts w:ascii="Calibri" w:cs="Calibri" w:eastAsia="Calibri" w:hAnsi="Calibri"/>
+          <w:b w:val="false"/>
+          <w:bCs w:val="false"/>
+          <w:i w:val="false"/>
+          <w:iCs w:val="false"/>
+          <w:sz w:val="21"/>
+          <w:szCs w:val="21"/>
+        </w:rPr>
+        <w:t xml:space="preserve"> A hook is loaded and unloaded thousands of times (every lift); forged steels such as </w:t>
+      </w:r>
+      <w:r>
+        <w:rPr>
+          <w:rFonts w:ascii="Calibri" w:cs="Calibri" w:eastAsia="Calibri" w:hAnsi="Calibri"/>
+          <w:b/>
+          <w:bCs/>
+          <w:i w:val="false"/>
+          <w:iCs w:val="false"/>
+          <w:sz w:val="21"/>
+          <w:szCs w:val="21"/>
+        </w:rPr>
+        <w:t xml:space="preserve">30C8</w:t>
+      </w:r>
+      <w:r>
+        <w:rPr>
+          <w:rFonts w:ascii="Calibri" w:cs="Calibri" w:eastAsia="Calibri" w:hAnsi="Calibri"/>
+          <w:b w:val="false"/>
+          <w:bCs w:val="false"/>
+          <w:i w:val="false"/>
+          <w:iCs w:val="false"/>
+          <w:sz w:val="21"/>
+          <w:szCs w:val="21"/>
+        </w:rPr>
+        <w:t xml:space="preserve"> or </w:t>
+      </w:r>
+      <w:r>
+        <w:rPr>
+          <w:rFonts w:ascii="Calibri" w:cs="Calibri" w:eastAsia="Calibri" w:hAnsi="Calibri"/>
+          <w:b/>
+          <w:bCs/>
+          <w:i w:val="false"/>
+          <w:iCs w:val="false"/>
+          <w:sz w:val="21"/>
+          <w:szCs w:val="21"/>
+        </w:rPr>
+        <w:t xml:space="preserve">40C8</w:t>
+      </w:r>
+      <w:r>
+        <w:rPr>
+          <w:rFonts w:ascii="Calibri" w:cs="Calibri" w:eastAsia="Calibri" w:hAnsi="Calibri"/>
+          <w:b w:val="false"/>
+          <w:bCs w:val="false"/>
+          <w:i w:val="false"/>
+          <w:iCs w:val="false"/>
+          <w:sz w:val="21"/>
+          <w:szCs w:val="21"/>
+        </w:rPr>
+        <w:t xml:space="preserve"> handle this far better than cast iron or cast steel.</w:t>
+      </w:r>
+    </w:p>
+    <w:p>
+      <w:pPr>
+        <w:spacing w:after="60" w:before="60" w:line="320" w:lineRule="auto"/>
+        <w:ind w:left="480" w:hanging="200"/>
+      </w:pPr>
+      <w:r>
+        <w:rPr>
+          <w:rFonts w:ascii="Calibri" w:cs="Calibri" w:eastAsia="Calibri" w:hAnsi="Calibri"/>
+          <w:b/>
+          <w:bCs/>
+          <w:i w:val="false"/>
+          <w:iCs w:val="false"/>
+          <w:color w:val="1F3864"/>
+          <w:sz w:val="21"/>
+          <w:szCs w:val="21"/>
+        </w:rPr>
+        <w:t xml:space="preserve">• </w:t>
+      </w:r>
+      <w:r>
+        <w:rPr>
+          <w:rFonts w:ascii="Calibri" w:cs="Calibri" w:eastAsia="Calibri" w:hAnsi="Calibri"/>
+          <w:b/>
+          <w:bCs/>
+          <w:i w:val="false"/>
+          <w:iCs w:val="false"/>
+          <w:sz w:val="21"/>
+          <w:szCs w:val="21"/>
+        </w:rPr>
+        <w:t xml:space="preserve">Ductile failure gives warning.</w:t>
+      </w:r>
+      <w:r>
+        <w:rPr>
+          <w:rFonts w:ascii="Calibri" w:cs="Calibri" w:eastAsia="Calibri" w:hAnsi="Calibri"/>
+          <w:b w:val="false"/>
+          <w:bCs w:val="false"/>
+          <w:i w:val="false"/>
+          <w:iCs w:val="false"/>
+          <w:sz w:val="21"/>
+          <w:szCs w:val="21"/>
+        </w:rPr>
+        <w:t xml:space="preserve"> A forged hook bends and stretches visibly before it breaks, so the operator can take corrective action; a cast hook is more brittle and may fail suddenly without any sign.</w:t>
+      </w:r>
+    </w:p>
+    <w:p>
+      <w:pPr>
+        <w:spacing w:after="60" w:before="60" w:line="320" w:lineRule="auto"/>
+        <w:ind w:left="480" w:hanging="200"/>
+      </w:pPr>
+      <w:r>
+        <w:rPr>
+          <w:rFonts w:ascii="Calibri" w:cs="Calibri" w:eastAsia="Calibri" w:hAnsi="Calibri"/>
+          <w:b/>
+          <w:bCs/>
+          <w:i w:val="false"/>
+          <w:iCs w:val="false"/>
+          <w:color w:val="1F3864"/>
+          <w:sz w:val="21"/>
+          <w:szCs w:val="21"/>
+        </w:rPr>
+        <w:t xml:space="preserve">• </w:t>
+      </w:r>
+      <w:r>
+        <w:rPr>
+          <w:rFonts w:ascii="Calibri" w:cs="Calibri" w:eastAsia="Calibri" w:hAnsi="Calibri"/>
+          <w:b/>
+          <w:bCs/>
+          <w:i w:val="false"/>
+          <w:iCs w:val="false"/>
+          <w:sz w:val="21"/>
+          <w:szCs w:val="21"/>
+        </w:rPr>
+        <w:t xml:space="preserve">Uniform material and reliable design.</w:t>
+      </w:r>
+      <w:r>
+        <w:rPr>
+          <w:rFonts w:ascii="Calibri" w:cs="Calibri" w:eastAsia="Calibri" w:hAnsi="Calibri"/>
+          <w:b w:val="false"/>
+          <w:bCs w:val="false"/>
+          <w:i w:val="false"/>
+          <w:iCs w:val="false"/>
+          <w:sz w:val="21"/>
+          <w:szCs w:val="21"/>
+        </w:rPr>
+        <w:t xml:space="preserve"> Properties are consistent throughout the hook, so the designer can trust the permissible stress used in the calculations and the actual factor of safety stays close to the design value.</w:t>
+      </w:r>
+    </w:p>
+    <w:p>
+      <w:pPr>
+        <w:spacing w:after="60" w:before="60" w:line="320" w:lineRule="auto"/>
+        <w:ind w:left="480" w:hanging="200"/>
+      </w:pPr>
+      <w:r>
+        <w:rPr>
+          <w:rFonts w:ascii="Calibri" w:cs="Calibri" w:eastAsia="Calibri" w:hAnsi="Calibri"/>
+          <w:b/>
+          <w:bCs/>
+          <w:i w:val="false"/>
+          <w:iCs w:val="false"/>
+          <w:color w:val="1F3864"/>
+          <w:sz w:val="21"/>
+          <w:szCs w:val="21"/>
+        </w:rPr>
+        <w:t xml:space="preserve">• </w:t>
+      </w:r>
+      <w:r>
+        <w:rPr>
+          <w:rFonts w:ascii="Calibri" w:cs="Calibri" w:eastAsia="Calibri" w:hAnsi="Calibri"/>
+          <w:b/>
+          <w:bCs/>
+          <w:i w:val="false"/>
+          <w:iCs w:val="false"/>
+          <w:sz w:val="21"/>
+          <w:szCs w:val="21"/>
+        </w:rPr>
+        <w:t xml:space="preserve">Better surface finish and easier inspection.</w:t>
+      </w:r>
+      <w:r>
+        <w:rPr>
+          <w:rFonts w:ascii="Calibri" w:cs="Calibri" w:eastAsia="Calibri" w:hAnsi="Calibri"/>
+          <w:b w:val="false"/>
+          <w:bCs w:val="false"/>
+          <w:i w:val="false"/>
+          <w:iCs w:val="false"/>
+          <w:sz w:val="21"/>
+          <w:szCs w:val="21"/>
+        </w:rPr>
+        <w:t xml:space="preserve"> The polished surface after forging and machining is easy to inspect by magnetic-particle or dye-penetrant testing — a cast surface hides small defects.</w:t>
       </w:r>
     </w:p>
     <w:p>
       <w:pPr>
         <w:keepNext/>
-        <w:spacing w:after="40" w:before="160" w:line="276" w:lineRule="auto"/>
+        <w:spacing w:after="60" w:before="260" w:line="276" w:lineRule="auto"/>
       </w:pPr>
       <w:r>
         <w:rPr>
@@ -156,7 +462,7 @@
     </w:p>
     <w:p>
       <w:pPr>
-        <w:spacing w:after="60" w:before="0" w:line="276" w:lineRule="auto"/>
+        <w:spacing w:after="150" w:before="0" w:line="340" w:lineRule="auto"/>
         <w:ind w:left="140"/>
       </w:pPr>
       <w:r>
@@ -169,13 +475,300 @@
           <w:sz w:val="21"/>
           <w:szCs w:val="21"/>
         </w:rPr>
-        <w:t xml:space="preserve">A sheave is a grooved pulley that guides the wire rope and changes its direction of pull. It also provides mechanical advantage in block-and-tackle arrangements and, because the rope rolls on a large-diameter groove, reduces wear and bending stress in the rope.</w:t>
+        <w:t xml:space="preserve">A </w:t>
+      </w:r>
+      <w:r>
+        <w:rPr>
+          <w:rFonts w:ascii="Calibri" w:cs="Calibri" w:eastAsia="Calibri" w:hAnsi="Calibri"/>
+          <w:b/>
+          <w:bCs/>
+          <w:i w:val="false"/>
+          <w:iCs w:val="false"/>
+          <w:sz w:val="21"/>
+          <w:szCs w:val="21"/>
+        </w:rPr>
+        <w:t xml:space="preserve">sheave</w:t>
+      </w:r>
+      <w:r>
+        <w:rPr>
+          <w:rFonts w:ascii="Calibri" w:cs="Calibri" w:eastAsia="Calibri" w:hAnsi="Calibri"/>
+          <w:b w:val="false"/>
+          <w:bCs w:val="false"/>
+          <w:i w:val="false"/>
+          <w:iCs w:val="false"/>
+          <w:sz w:val="21"/>
+          <w:szCs w:val="21"/>
+        </w:rPr>
+        <w:t xml:space="preserve"> is a grooved pulley over which the wire rope runs. It is a basic element of every hoist and crane and serves several purposes at the same time:</w:t>
+      </w:r>
+    </w:p>
+    <w:p>
+      <w:pPr>
+        <w:spacing w:after="60" w:before="60" w:line="320" w:lineRule="auto"/>
+        <w:ind w:left="480" w:hanging="200"/>
+      </w:pPr>
+      <w:r>
+        <w:rPr>
+          <w:rFonts w:ascii="Calibri" w:cs="Calibri" w:eastAsia="Calibri" w:hAnsi="Calibri"/>
+          <w:b/>
+          <w:bCs/>
+          <w:i w:val="false"/>
+          <w:iCs w:val="false"/>
+          <w:color w:val="1F3864"/>
+          <w:sz w:val="21"/>
+          <w:szCs w:val="21"/>
+        </w:rPr>
+        <w:t xml:space="preserve">• </w:t>
+      </w:r>
+      <w:r>
+        <w:rPr>
+          <w:rFonts w:ascii="Calibri" w:cs="Calibri" w:eastAsia="Calibri" w:hAnsi="Calibri"/>
+          <w:b/>
+          <w:bCs/>
+          <w:i w:val="false"/>
+          <w:iCs w:val="false"/>
+          <w:sz w:val="21"/>
+          <w:szCs w:val="21"/>
+        </w:rPr>
+        <w:t xml:space="preserve">Guides</w:t>
+      </w:r>
+      <w:r>
+        <w:rPr>
+          <w:rFonts w:ascii="Calibri" w:cs="Calibri" w:eastAsia="Calibri" w:hAnsi="Calibri"/>
+          <w:b w:val="false"/>
+          <w:bCs w:val="false"/>
+          <w:i w:val="false"/>
+          <w:iCs w:val="false"/>
+          <w:sz w:val="21"/>
+          <w:szCs w:val="21"/>
+        </w:rPr>
+        <w:t xml:space="preserve"> the rope along a definite path and </w:t>
+      </w:r>
+      <w:r>
+        <w:rPr>
+          <w:rFonts w:ascii="Calibri" w:cs="Calibri" w:eastAsia="Calibri" w:hAnsi="Calibri"/>
+          <w:b/>
+          <w:bCs/>
+          <w:i w:val="false"/>
+          <w:iCs w:val="false"/>
+          <w:sz w:val="21"/>
+          <w:szCs w:val="21"/>
+        </w:rPr>
+        <w:t xml:space="preserve">changes its direction of pull</w:t>
+      </w:r>
+      <w:r>
+        <w:rPr>
+          <w:rFonts w:ascii="Calibri" w:cs="Calibri" w:eastAsia="Calibri" w:hAnsi="Calibri"/>
+          <w:b w:val="false"/>
+          <w:bCs w:val="false"/>
+          <w:i w:val="false"/>
+          <w:iCs w:val="false"/>
+          <w:sz w:val="21"/>
+          <w:szCs w:val="21"/>
+        </w:rPr>
+        <w:t xml:space="preserve"> (for example, from the drum down to the hook).</w:t>
+      </w:r>
+    </w:p>
+    <w:p>
+      <w:pPr>
+        <w:spacing w:after="60" w:before="60" w:line="320" w:lineRule="auto"/>
+        <w:ind w:left="480" w:hanging="200"/>
+      </w:pPr>
+      <w:r>
+        <w:rPr>
+          <w:rFonts w:ascii="Calibri" w:cs="Calibri" w:eastAsia="Calibri" w:hAnsi="Calibri"/>
+          <w:b/>
+          <w:bCs/>
+          <w:i w:val="false"/>
+          <w:iCs w:val="false"/>
+          <w:color w:val="1F3864"/>
+          <w:sz w:val="21"/>
+          <w:szCs w:val="21"/>
+        </w:rPr>
+        <w:t xml:space="preserve">• </w:t>
+      </w:r>
+      <w:r>
+        <w:rPr>
+          <w:rFonts w:ascii="Calibri" w:cs="Calibri" w:eastAsia="Calibri" w:hAnsi="Calibri"/>
+          <w:b/>
+          <w:bCs/>
+          <w:i w:val="false"/>
+          <w:iCs w:val="false"/>
+          <w:sz w:val="21"/>
+          <w:szCs w:val="21"/>
+        </w:rPr>
+        <w:t xml:space="preserve">Provides mechanical advantage</w:t>
+      </w:r>
+      <w:r>
+        <w:rPr>
+          <w:rFonts w:ascii="Calibri" w:cs="Calibri" w:eastAsia="Calibri" w:hAnsi="Calibri"/>
+          <w:b w:val="false"/>
+          <w:bCs w:val="false"/>
+          <w:i w:val="false"/>
+          <w:iCs w:val="false"/>
+          <w:sz w:val="21"/>
+          <w:szCs w:val="21"/>
+        </w:rPr>
+        <w:t xml:space="preserve"> when used as a movable sheave in a block-and-tackle, so a smaller effort P can lift a larger load W (W = n × P × η, where n = number of rope parts). The trade-off is that the effort has to travel n times the distance.</w:t>
+      </w:r>
+    </w:p>
+    <w:p>
+      <w:pPr>
+        <w:spacing w:after="60" w:before="60" w:line="320" w:lineRule="auto"/>
+        <w:ind w:left="480" w:hanging="200"/>
+      </w:pPr>
+      <w:r>
+        <w:rPr>
+          <w:rFonts w:ascii="Calibri" w:cs="Calibri" w:eastAsia="Calibri" w:hAnsi="Calibri"/>
+          <w:b/>
+          <w:bCs/>
+          <w:i w:val="false"/>
+          <w:iCs w:val="false"/>
+          <w:color w:val="1F3864"/>
+          <w:sz w:val="21"/>
+          <w:szCs w:val="21"/>
+        </w:rPr>
+        <w:t xml:space="preserve">• </w:t>
+      </w:r>
+      <w:r>
+        <w:rPr>
+          <w:rFonts w:ascii="Calibri" w:cs="Calibri" w:eastAsia="Calibri" w:hAnsi="Calibri"/>
+          <w:b/>
+          <w:bCs/>
+          <w:i w:val="false"/>
+          <w:iCs w:val="false"/>
+          <w:sz w:val="21"/>
+          <w:szCs w:val="21"/>
+        </w:rPr>
+        <w:t xml:space="preserve">Reduces friction</w:t>
+      </w:r>
+      <w:r>
+        <w:rPr>
+          <w:rFonts w:ascii="Calibri" w:cs="Calibri" w:eastAsia="Calibri" w:hAnsi="Calibri"/>
+          <w:b w:val="false"/>
+          <w:bCs w:val="false"/>
+          <w:i w:val="false"/>
+          <w:iCs w:val="false"/>
+          <w:sz w:val="21"/>
+          <w:szCs w:val="21"/>
+        </w:rPr>
+        <w:t xml:space="preserve">, because the rope rolls over the sheave on its own bearing instead of sliding over a fixed surface. This cuts the rope wear and the power lost.</w:t>
+      </w:r>
+    </w:p>
+    <w:p>
+      <w:pPr>
+        <w:spacing w:after="60" w:before="60" w:line="320" w:lineRule="auto"/>
+        <w:ind w:left="480" w:hanging="200"/>
+      </w:pPr>
+      <w:r>
+        <w:rPr>
+          <w:rFonts w:ascii="Calibri" w:cs="Calibri" w:eastAsia="Calibri" w:hAnsi="Calibri"/>
+          <w:b/>
+          <w:bCs/>
+          <w:i w:val="false"/>
+          <w:iCs w:val="false"/>
+          <w:color w:val="1F3864"/>
+          <w:sz w:val="21"/>
+          <w:szCs w:val="21"/>
+        </w:rPr>
+        <w:t xml:space="preserve">• </w:t>
+      </w:r>
+      <w:r>
+        <w:rPr>
+          <w:rFonts w:ascii="Calibri" w:cs="Calibri" w:eastAsia="Calibri" w:hAnsi="Calibri"/>
+          <w:b/>
+          <w:bCs/>
+          <w:i w:val="false"/>
+          <w:iCs w:val="false"/>
+          <w:sz w:val="21"/>
+          <w:szCs w:val="21"/>
+        </w:rPr>
+        <w:t xml:space="preserve">Increases rope life</w:t>
+      </w:r>
+      <w:r>
+        <w:rPr>
+          <w:rFonts w:ascii="Calibri" w:cs="Calibri" w:eastAsia="Calibri" w:hAnsi="Calibri"/>
+          <w:b w:val="false"/>
+          <w:bCs w:val="false"/>
+          <w:i w:val="false"/>
+          <w:iCs w:val="false"/>
+          <w:sz w:val="21"/>
+          <w:szCs w:val="21"/>
+        </w:rPr>
+        <w:t xml:space="preserve"> — a large groove diameter (typically </w:t>
+      </w:r>
+      <w:r>
+        <w:rPr>
+          <w:rFonts w:ascii="Calibri" w:cs="Calibri" w:eastAsia="Calibri" w:hAnsi="Calibri"/>
+          <w:b/>
+          <w:bCs/>
+          <w:i w:val="false"/>
+          <w:iCs w:val="false"/>
+          <w:sz w:val="21"/>
+          <w:szCs w:val="21"/>
+        </w:rPr>
+        <w:t xml:space="preserve">D = 20 – 40 × rope dia</w:t>
+      </w:r>
+      <w:r>
+        <w:rPr>
+          <w:rFonts w:ascii="Calibri" w:cs="Calibri" w:eastAsia="Calibri" w:hAnsi="Calibri"/>
+          <w:b w:val="false"/>
+          <w:bCs w:val="false"/>
+          <w:i w:val="false"/>
+          <w:iCs w:val="false"/>
+          <w:sz w:val="21"/>
+          <w:szCs w:val="21"/>
+        </w:rPr>
+        <w:t xml:space="preserve">) keeps the bending stress in the individual wires low, and the semicircular groove supports the rope evenly without flattening it.</w:t>
+      </w:r>
+    </w:p>
+    <w:p>
+      <w:pPr>
+        <w:spacing w:after="60" w:before="60" w:line="320" w:lineRule="auto"/>
+        <w:ind w:left="480" w:hanging="200"/>
+      </w:pPr>
+      <w:r>
+        <w:rPr>
+          <w:rFonts w:ascii="Calibri" w:cs="Calibri" w:eastAsia="Calibri" w:hAnsi="Calibri"/>
+          <w:b/>
+          <w:bCs/>
+          <w:i w:val="false"/>
+          <w:iCs w:val="false"/>
+          <w:color w:val="1F3864"/>
+          <w:sz w:val="21"/>
+          <w:szCs w:val="21"/>
+        </w:rPr>
+        <w:t xml:space="preserve">• </w:t>
+      </w:r>
+      <w:r>
+        <w:rPr>
+          <w:rFonts w:ascii="Calibri" w:cs="Calibri" w:eastAsia="Calibri" w:hAnsi="Calibri"/>
+          <w:b/>
+          <w:bCs/>
+          <w:i w:val="false"/>
+          <w:iCs w:val="false"/>
+          <w:sz w:val="21"/>
+          <w:szCs w:val="21"/>
+        </w:rPr>
+        <w:t xml:space="preserve">Keeps the rope on the drum straight</w:t>
+      </w:r>
+      <w:r>
+        <w:rPr>
+          <w:rFonts w:ascii="Calibri" w:cs="Calibri" w:eastAsia="Calibri" w:hAnsi="Calibri"/>
+          <w:b w:val="false"/>
+          <w:bCs w:val="false"/>
+          <w:i w:val="false"/>
+          <w:iCs w:val="false"/>
+          <w:sz w:val="21"/>
+          <w:szCs w:val="21"/>
+        </w:rPr>
+        <w:t xml:space="preserve">, by acting as a guide-pulley above the drum so the fleet angle stays within the recommended ± 4°.</w:t>
       </w:r>
     </w:p>
     <w:p>
       <w:pPr>
         <w:keepNext/>
-        <w:spacing w:after="40" w:before="160" w:line="276" w:lineRule="auto"/>
+        <w:spacing w:after="60" w:before="260" w:line="276" w:lineRule="auto"/>
       </w:pPr>
       <w:r>
         <w:rPr>
@@ -205,7 +798,7 @@
     </w:p>
     <w:p>
       <w:pPr>
-        <w:spacing w:after="60" w:before="0" w:line="276" w:lineRule="auto"/>
+        <w:spacing w:after="150" w:before="0" w:line="340" w:lineRule="auto"/>
         <w:ind w:left="140"/>
       </w:pPr>
       <w:r>
@@ -218,133 +811,652 @@
           <w:sz w:val="21"/>
           <w:szCs w:val="21"/>
         </w:rPr>
-        <w:t xml:space="preserve">Typical FOS values: </w:t>
-      </w:r>
-      <w:r>
-        <w:rPr>
-          <w:rFonts w:ascii="Calibri" w:cs="Calibri" w:eastAsia="Calibri" w:hAnsi="Calibri"/>
-          <w:b/>
-          <w:bCs/>
-          <w:i w:val="false"/>
-          <w:iCs w:val="false"/>
-          <w:sz w:val="21"/>
-          <w:szCs w:val="21"/>
-        </w:rPr>
-        <w:t xml:space="preserve">wire rope for cranes 5–6</w:t>
-      </w:r>
-      <w:r>
-        <w:rPr>
-          <w:rFonts w:ascii="Calibri" w:cs="Calibri" w:eastAsia="Calibri" w:hAnsi="Calibri"/>
-          <w:b w:val="false"/>
-          <w:bCs w:val="false"/>
-          <w:i w:val="false"/>
-          <w:iCs w:val="false"/>
-          <w:sz w:val="21"/>
-          <w:szCs w:val="21"/>
-        </w:rPr>
-        <w:t xml:space="preserve">, </w:t>
-      </w:r>
-      <w:r>
-        <w:rPr>
-          <w:rFonts w:ascii="Calibri" w:cs="Calibri" w:eastAsia="Calibri" w:hAnsi="Calibri"/>
-          <w:b/>
-          <w:bCs/>
-          <w:i w:val="false"/>
-          <w:iCs w:val="false"/>
-          <w:sz w:val="21"/>
-          <w:szCs w:val="21"/>
-        </w:rPr>
-        <w:t xml:space="preserve">passenger-lift/mine ropes 8–12</w:t>
-      </w:r>
-      <w:r>
-        <w:rPr>
-          <w:rFonts w:ascii="Calibri" w:cs="Calibri" w:eastAsia="Calibri" w:hAnsi="Calibri"/>
-          <w:b w:val="false"/>
-          <w:bCs w:val="false"/>
-          <w:i w:val="false"/>
-          <w:iCs w:val="false"/>
-          <w:sz w:val="21"/>
-          <w:szCs w:val="21"/>
-        </w:rPr>
-        <w:t xml:space="preserve">, </w:t>
-      </w:r>
-      <w:r>
-        <w:rPr>
-          <w:rFonts w:ascii="Calibri" w:cs="Calibri" w:eastAsia="Calibri" w:hAnsi="Calibri"/>
-          <w:b/>
-          <w:bCs/>
-          <w:i w:val="false"/>
-          <w:iCs w:val="false"/>
-          <w:sz w:val="21"/>
-          <w:szCs w:val="21"/>
-        </w:rPr>
-        <w:t xml:space="preserve">forged crane hook 4–6</w:t>
-      </w:r>
-      <w:r>
-        <w:rPr>
-          <w:rFonts w:ascii="Calibri" w:cs="Calibri" w:eastAsia="Calibri" w:hAnsi="Calibri"/>
-          <w:b w:val="false"/>
-          <w:bCs w:val="false"/>
-          <w:i w:val="false"/>
-          <w:iCs w:val="false"/>
-          <w:sz w:val="21"/>
-          <w:szCs w:val="21"/>
-        </w:rPr>
-        <w:t xml:space="preserve">, </w:t>
-      </w:r>
-      <w:r>
-        <w:rPr>
-          <w:rFonts w:ascii="Calibri" w:cs="Calibri" w:eastAsia="Calibri" w:hAnsi="Calibri"/>
-          <w:b/>
-          <w:bCs/>
-          <w:i w:val="false"/>
-          <w:iCs w:val="false"/>
-          <w:sz w:val="21"/>
-          <w:szCs w:val="21"/>
-        </w:rPr>
-        <w:t xml:space="preserve">lifting chains 4–5</w:t>
-      </w:r>
-      <w:r>
-        <w:rPr>
-          <w:rFonts w:ascii="Calibri" w:cs="Calibri" w:eastAsia="Calibri" w:hAnsi="Calibri"/>
-          <w:b w:val="false"/>
-          <w:bCs w:val="false"/>
-          <w:i w:val="false"/>
-          <w:iCs w:val="false"/>
-          <w:sz w:val="21"/>
-          <w:szCs w:val="21"/>
-        </w:rPr>
-        <w:t xml:space="preserve">, </w:t>
-      </w:r>
-      <w:r>
-        <w:rPr>
-          <w:rFonts w:ascii="Calibri" w:cs="Calibri" w:eastAsia="Calibri" w:hAnsi="Calibri"/>
-          <w:b/>
-          <w:bCs/>
-          <w:i w:val="false"/>
-          <w:iCs w:val="false"/>
-          <w:sz w:val="21"/>
-          <w:szCs w:val="21"/>
-        </w:rPr>
-        <w:t xml:space="preserve">pins &amp; shafts 3–4</w:t>
-      </w:r>
-      <w:r>
-        <w:rPr>
-          <w:rFonts w:ascii="Calibri" w:cs="Calibri" w:eastAsia="Calibri" w:hAnsi="Calibri"/>
-          <w:b w:val="false"/>
-          <w:bCs w:val="false"/>
-          <w:i w:val="false"/>
-          <w:iCs w:val="false"/>
-          <w:sz w:val="21"/>
-          <w:szCs w:val="21"/>
-        </w:rPr>
-        <w:t xml:space="preserve">. Values are high because of shock loads and human safety. (For a given problem use the FOS stated — e.g. 5 in Q8, 30 in Q9.)</w:t>
+        <w:t xml:space="preserve">Lifting equipment carries heavy loads, is subject to shocks, and failure directly endangers life. For this reason the factor of safety (FOS) is kept much higher than in general machine design. The exact value depends on the component and on the applicable code (IS 2266 for wire ropes, IS 807 for cranes, IS 2938 for lifts).</w:t>
+      </w:r>
+    </w:p>
+    <w:tbl>
+      <w:tblPr>
+        <w:tblW w:type="dxa" w:w="9740"/>
+        <w:tblBorders>
+          <w:top w:val="single" w:color="9FB0C9" w:sz="4"/>
+          <w:left w:val="single" w:color="9FB0C9" w:sz="4"/>
+          <w:bottom w:val="single" w:color="9FB0C9" w:sz="4"/>
+          <w:right w:val="single" w:color="9FB0C9" w:sz="4"/>
+          <w:insideH w:val="single" w:color="9FB0C9" w:sz="4"/>
+          <w:insideV w:val="single" w:color="9FB0C9" w:sz="4"/>
+        </w:tblBorders>
+      </w:tblPr>
+      <w:tblGrid>
+        <w:gridCol w:w="3896"/>
+        <w:gridCol w:w="1948"/>
+        <w:gridCol w:w="3896"/>
+      </w:tblGrid>
+      <w:tr>
+        <w:trPr>
+          <w:cantSplit/>
+          <w:tblHeader/>
+        </w:trPr>
+        <w:tc>
+          <w:tcPr>
+            <w:tcW w:type="dxa" w:w="3896"/>
+            <w:shd w:fill="D9E2F1" w:color="auto" w:val="clear"/>
+            <w:tcMar>
+              <w:top w:type="dxa" w:w="60"/>
+              <w:left w:type="dxa" w:w="110"/>
+              <w:bottom w:type="dxa" w:w="60"/>
+              <w:right w:type="dxa" w:w="110"/>
+            </w:tcMar>
+            <w:vAlign w:val="center"/>
+          </w:tcPr>
+          <w:p>
+            <w:pPr>
+              <w:spacing w:after="26" w:before="26"/>
+              <w:jc w:val="center"/>
+            </w:pPr>
+            <w:r>
+              <w:rPr>
+                <w:rFonts w:ascii="Calibri" w:cs="Calibri" w:eastAsia="Calibri" w:hAnsi="Calibri"/>
+                <w:b/>
+                <w:bCs/>
+                <w:i w:val="false"/>
+                <w:iCs w:val="false"/>
+                <w:sz w:val="17"/>
+                <w:szCs w:val="17"/>
+              </w:rPr>
+              <w:t xml:space="preserve">Component</w:t>
+            </w:r>
+          </w:p>
+        </w:tc>
+        <w:tc>
+          <w:tcPr>
+            <w:tcW w:type="dxa" w:w="1948"/>
+            <w:shd w:fill="D9E2F1" w:color="auto" w:val="clear"/>
+            <w:tcMar>
+              <w:top w:type="dxa" w:w="60"/>
+              <w:left w:type="dxa" w:w="110"/>
+              <w:bottom w:type="dxa" w:w="60"/>
+              <w:right w:type="dxa" w:w="110"/>
+            </w:tcMar>
+            <w:vAlign w:val="center"/>
+          </w:tcPr>
+          <w:p>
+            <w:pPr>
+              <w:spacing w:after="26" w:before="26"/>
+              <w:jc w:val="center"/>
+            </w:pPr>
+            <w:r>
+              <w:rPr>
+                <w:rFonts w:ascii="Calibri" w:cs="Calibri" w:eastAsia="Calibri" w:hAnsi="Calibri"/>
+                <w:b/>
+                <w:bCs/>
+                <w:i w:val="false"/>
+                <w:iCs w:val="false"/>
+                <w:sz w:val="17"/>
+                <w:szCs w:val="17"/>
+              </w:rPr>
+              <w:t xml:space="preserve">Typical FOS</w:t>
+            </w:r>
+          </w:p>
+        </w:tc>
+        <w:tc>
+          <w:tcPr>
+            <w:tcW w:type="dxa" w:w="3896"/>
+            <w:shd w:fill="D9E2F1" w:color="auto" w:val="clear"/>
+            <w:tcMar>
+              <w:top w:type="dxa" w:w="60"/>
+              <w:left w:type="dxa" w:w="110"/>
+              <w:bottom w:type="dxa" w:w="60"/>
+              <w:right w:type="dxa" w:w="110"/>
+            </w:tcMar>
+            <w:vAlign w:val="center"/>
+          </w:tcPr>
+          <w:p>
+            <w:pPr>
+              <w:spacing w:after="26" w:before="26"/>
+              <w:jc w:val="center"/>
+            </w:pPr>
+            <w:r>
+              <w:rPr>
+                <w:rFonts w:ascii="Calibri" w:cs="Calibri" w:eastAsia="Calibri" w:hAnsi="Calibri"/>
+                <w:b/>
+                <w:bCs/>
+                <w:i w:val="false"/>
+                <w:iCs w:val="false"/>
+                <w:sz w:val="17"/>
+                <w:szCs w:val="17"/>
+              </w:rPr>
+              <w:t xml:space="preserve">Remark</w:t>
+            </w:r>
+          </w:p>
+        </w:tc>
+      </w:tr>
+      <w:tr>
+        <w:trPr>
+          <w:cantSplit/>
+        </w:trPr>
+        <w:tc>
+          <w:tcPr>
+            <w:tcW w:type="dxa" w:w="3896"/>
+            <w:shd w:fill="FFFFFF" w:color="auto" w:val="clear"/>
+            <w:tcMar>
+              <w:top w:type="dxa" w:w="60"/>
+              <w:left w:type="dxa" w:w="110"/>
+              <w:bottom w:type="dxa" w:w="60"/>
+              <w:right w:type="dxa" w:w="110"/>
+            </w:tcMar>
+            <w:vAlign w:val="center"/>
+          </w:tcPr>
+          <w:p>
+            <w:pPr>
+              <w:spacing w:after="26" w:before="26" w:line="252" w:lineRule="auto"/>
+            </w:pPr>
+            <w:r>
+              <w:rPr>
+                <w:rFonts w:ascii="Calibri" w:cs="Calibri" w:eastAsia="Calibri" w:hAnsi="Calibri"/>
+                <w:b w:val="false"/>
+                <w:bCs w:val="false"/>
+                <w:i w:val="false"/>
+                <w:iCs w:val="false"/>
+                <w:sz w:val="17"/>
+                <w:szCs w:val="17"/>
+              </w:rPr>
+              <w:t xml:space="preserve">Wire rope for cranes and hoists</w:t>
+            </w:r>
+          </w:p>
+        </w:tc>
+        <w:tc>
+          <w:tcPr>
+            <w:tcW w:type="dxa" w:w="1948"/>
+            <w:shd w:fill="FFFFFF" w:color="auto" w:val="clear"/>
+            <w:tcMar>
+              <w:top w:type="dxa" w:w="60"/>
+              <w:left w:type="dxa" w:w="110"/>
+              <w:bottom w:type="dxa" w:w="60"/>
+              <w:right w:type="dxa" w:w="110"/>
+            </w:tcMar>
+            <w:vAlign w:val="center"/>
+          </w:tcPr>
+          <w:p>
+            <w:pPr>
+              <w:spacing w:after="26" w:before="26" w:line="252" w:lineRule="auto"/>
+            </w:pPr>
+            <w:r>
+              <w:rPr>
+                <w:rFonts w:ascii="Calibri" w:cs="Calibri" w:eastAsia="Calibri" w:hAnsi="Calibri"/>
+                <w:b w:val="false"/>
+                <w:bCs w:val="false"/>
+                <w:i w:val="false"/>
+                <w:iCs w:val="false"/>
+                <w:sz w:val="17"/>
+                <w:szCs w:val="17"/>
+              </w:rPr>
+              <w:t xml:space="preserve">5 – 6</w:t>
+            </w:r>
+          </w:p>
+        </w:tc>
+        <w:tc>
+          <w:tcPr>
+            <w:tcW w:type="dxa" w:w="3896"/>
+            <w:shd w:fill="FFFFFF" w:color="auto" w:val="clear"/>
+            <w:tcMar>
+              <w:top w:type="dxa" w:w="60"/>
+              <w:left w:type="dxa" w:w="110"/>
+              <w:bottom w:type="dxa" w:w="60"/>
+              <w:right w:type="dxa" w:w="110"/>
+            </w:tcMar>
+            <w:vAlign w:val="center"/>
+          </w:tcPr>
+          <w:p>
+            <w:pPr>
+              <w:spacing w:after="26" w:before="26" w:line="252" w:lineRule="auto"/>
+            </w:pPr>
+            <w:r>
+              <w:rPr>
+                <w:rFonts w:ascii="Calibri" w:cs="Calibri" w:eastAsia="Calibri" w:hAnsi="Calibri"/>
+                <w:b w:val="false"/>
+                <w:bCs w:val="false"/>
+                <w:i w:val="false"/>
+                <w:iCs w:val="false"/>
+                <w:sz w:val="17"/>
+                <w:szCs w:val="17"/>
+              </w:rPr>
+              <w:t xml:space="preserve">Based on the rope’s breaking load</w:t>
+            </w:r>
+          </w:p>
+        </w:tc>
+      </w:tr>
+      <w:tr>
+        <w:trPr>
+          <w:cantSplit/>
+        </w:trPr>
+        <w:tc>
+          <w:tcPr>
+            <w:tcW w:type="dxa" w:w="3896"/>
+            <w:shd w:fill="F6F8FC" w:color="auto" w:val="clear"/>
+            <w:tcMar>
+              <w:top w:type="dxa" w:w="60"/>
+              <w:left w:type="dxa" w:w="110"/>
+              <w:bottom w:type="dxa" w:w="60"/>
+              <w:right w:type="dxa" w:w="110"/>
+            </w:tcMar>
+            <w:vAlign w:val="center"/>
+          </w:tcPr>
+          <w:p>
+            <w:pPr>
+              <w:spacing w:after="26" w:before="26" w:line="252" w:lineRule="auto"/>
+            </w:pPr>
+            <w:r>
+              <w:rPr>
+                <w:rFonts w:ascii="Calibri" w:cs="Calibri" w:eastAsia="Calibri" w:hAnsi="Calibri"/>
+                <w:b w:val="false"/>
+                <w:bCs w:val="false"/>
+                <w:i w:val="false"/>
+                <w:iCs w:val="false"/>
+                <w:sz w:val="17"/>
+                <w:szCs w:val="17"/>
+              </w:rPr>
+              <w:t xml:space="preserve">Wire rope for passenger lifts / mine hoists</w:t>
+            </w:r>
+          </w:p>
+        </w:tc>
+        <w:tc>
+          <w:tcPr>
+            <w:tcW w:type="dxa" w:w="1948"/>
+            <w:shd w:fill="F6F8FC" w:color="auto" w:val="clear"/>
+            <w:tcMar>
+              <w:top w:type="dxa" w:w="60"/>
+              <w:left w:type="dxa" w:w="110"/>
+              <w:bottom w:type="dxa" w:w="60"/>
+              <w:right w:type="dxa" w:w="110"/>
+            </w:tcMar>
+            <w:vAlign w:val="center"/>
+          </w:tcPr>
+          <w:p>
+            <w:pPr>
+              <w:spacing w:after="26" w:before="26" w:line="252" w:lineRule="auto"/>
+            </w:pPr>
+            <w:r>
+              <w:rPr>
+                <w:rFonts w:ascii="Calibri" w:cs="Calibri" w:eastAsia="Calibri" w:hAnsi="Calibri"/>
+                <w:b w:val="false"/>
+                <w:bCs w:val="false"/>
+                <w:i w:val="false"/>
+                <w:iCs w:val="false"/>
+                <w:sz w:val="17"/>
+                <w:szCs w:val="17"/>
+              </w:rPr>
+              <w:t xml:space="preserve">8 – 12</w:t>
+            </w:r>
+          </w:p>
+        </w:tc>
+        <w:tc>
+          <w:tcPr>
+            <w:tcW w:type="dxa" w:w="3896"/>
+            <w:shd w:fill="F6F8FC" w:color="auto" w:val="clear"/>
+            <w:tcMar>
+              <w:top w:type="dxa" w:w="60"/>
+              <w:left w:type="dxa" w:w="110"/>
+              <w:bottom w:type="dxa" w:w="60"/>
+              <w:right w:type="dxa" w:w="110"/>
+            </w:tcMar>
+            <w:vAlign w:val="center"/>
+          </w:tcPr>
+          <w:p>
+            <w:pPr>
+              <w:spacing w:after="26" w:before="26" w:line="252" w:lineRule="auto"/>
+            </w:pPr>
+            <w:r>
+              <w:rPr>
+                <w:rFonts w:ascii="Calibri" w:cs="Calibri" w:eastAsia="Calibri" w:hAnsi="Calibri"/>
+                <w:b w:val="false"/>
+                <w:bCs w:val="false"/>
+                <w:i w:val="false"/>
+                <w:iCs w:val="false"/>
+                <w:sz w:val="17"/>
+                <w:szCs w:val="17"/>
+              </w:rPr>
+              <w:t xml:space="preserve">Higher because lives are at risk</w:t>
+            </w:r>
+          </w:p>
+        </w:tc>
+      </w:tr>
+      <w:tr>
+        <w:trPr>
+          <w:cantSplit/>
+        </w:trPr>
+        <w:tc>
+          <w:tcPr>
+            <w:tcW w:type="dxa" w:w="3896"/>
+            <w:shd w:fill="FFFFFF" w:color="auto" w:val="clear"/>
+            <w:tcMar>
+              <w:top w:type="dxa" w:w="60"/>
+              <w:left w:type="dxa" w:w="110"/>
+              <w:bottom w:type="dxa" w:w="60"/>
+              <w:right w:type="dxa" w:w="110"/>
+            </w:tcMar>
+            <w:vAlign w:val="center"/>
+          </w:tcPr>
+          <w:p>
+            <w:pPr>
+              <w:spacing w:after="26" w:before="26" w:line="252" w:lineRule="auto"/>
+            </w:pPr>
+            <w:r>
+              <w:rPr>
+                <w:rFonts w:ascii="Calibri" w:cs="Calibri" w:eastAsia="Calibri" w:hAnsi="Calibri"/>
+                <w:b w:val="false"/>
+                <w:bCs w:val="false"/>
+                <w:i w:val="false"/>
+                <w:iCs w:val="false"/>
+                <w:sz w:val="17"/>
+                <w:szCs w:val="17"/>
+              </w:rPr>
+              <w:t xml:space="preserve">Forged crane hook</w:t>
+            </w:r>
+          </w:p>
+        </w:tc>
+        <w:tc>
+          <w:tcPr>
+            <w:tcW w:type="dxa" w:w="1948"/>
+            <w:shd w:fill="FFFFFF" w:color="auto" w:val="clear"/>
+            <w:tcMar>
+              <w:top w:type="dxa" w:w="60"/>
+              <w:left w:type="dxa" w:w="110"/>
+              <w:bottom w:type="dxa" w:w="60"/>
+              <w:right w:type="dxa" w:w="110"/>
+            </w:tcMar>
+            <w:vAlign w:val="center"/>
+          </w:tcPr>
+          <w:p>
+            <w:pPr>
+              <w:spacing w:after="26" w:before="26" w:line="252" w:lineRule="auto"/>
+            </w:pPr>
+            <w:r>
+              <w:rPr>
+                <w:rFonts w:ascii="Calibri" w:cs="Calibri" w:eastAsia="Calibri" w:hAnsi="Calibri"/>
+                <w:b w:val="false"/>
+                <w:bCs w:val="false"/>
+                <w:i w:val="false"/>
+                <w:iCs w:val="false"/>
+                <w:sz w:val="17"/>
+                <w:szCs w:val="17"/>
+              </w:rPr>
+              <w:t xml:space="preserve">4 – 6</w:t>
+            </w:r>
+          </w:p>
+        </w:tc>
+        <w:tc>
+          <w:tcPr>
+            <w:tcW w:type="dxa" w:w="3896"/>
+            <w:shd w:fill="FFFFFF" w:color="auto" w:val="clear"/>
+            <w:tcMar>
+              <w:top w:type="dxa" w:w="60"/>
+              <w:left w:type="dxa" w:w="110"/>
+              <w:bottom w:type="dxa" w:w="60"/>
+              <w:right w:type="dxa" w:w="110"/>
+            </w:tcMar>
+            <w:vAlign w:val="center"/>
+          </w:tcPr>
+          <w:p>
+            <w:pPr>
+              <w:spacing w:after="26" w:before="26" w:line="252" w:lineRule="auto"/>
+            </w:pPr>
+            <w:r>
+              <w:rPr>
+                <w:rFonts w:ascii="Calibri" w:cs="Calibri" w:eastAsia="Calibri" w:hAnsi="Calibri"/>
+                <w:b w:val="false"/>
+                <w:bCs w:val="false"/>
+                <w:i w:val="false"/>
+                <w:iCs w:val="false"/>
+                <w:sz w:val="17"/>
+                <w:szCs w:val="17"/>
+              </w:rPr>
+              <w:t xml:space="preserve">Based on yield or ultimate strength</w:t>
+            </w:r>
+          </w:p>
+        </w:tc>
+      </w:tr>
+      <w:tr>
+        <w:trPr>
+          <w:cantSplit/>
+        </w:trPr>
+        <w:tc>
+          <w:tcPr>
+            <w:tcW w:type="dxa" w:w="3896"/>
+            <w:shd w:fill="F6F8FC" w:color="auto" w:val="clear"/>
+            <w:tcMar>
+              <w:top w:type="dxa" w:w="60"/>
+              <w:left w:type="dxa" w:w="110"/>
+              <w:bottom w:type="dxa" w:w="60"/>
+              <w:right w:type="dxa" w:w="110"/>
+            </w:tcMar>
+            <w:vAlign w:val="center"/>
+          </w:tcPr>
+          <w:p>
+            <w:pPr>
+              <w:spacing w:after="26" w:before="26" w:line="252" w:lineRule="auto"/>
+            </w:pPr>
+            <w:r>
+              <w:rPr>
+                <w:rFonts w:ascii="Calibri" w:cs="Calibri" w:eastAsia="Calibri" w:hAnsi="Calibri"/>
+                <w:b w:val="false"/>
+                <w:bCs w:val="false"/>
+                <w:i w:val="false"/>
+                <w:iCs w:val="false"/>
+                <w:sz w:val="17"/>
+                <w:szCs w:val="17"/>
+              </w:rPr>
+              <w:t xml:space="preserve">Lifting chains</w:t>
+            </w:r>
+          </w:p>
+        </w:tc>
+        <w:tc>
+          <w:tcPr>
+            <w:tcW w:type="dxa" w:w="1948"/>
+            <w:shd w:fill="F6F8FC" w:color="auto" w:val="clear"/>
+            <w:tcMar>
+              <w:top w:type="dxa" w:w="60"/>
+              <w:left w:type="dxa" w:w="110"/>
+              <w:bottom w:type="dxa" w:w="60"/>
+              <w:right w:type="dxa" w:w="110"/>
+            </w:tcMar>
+            <w:vAlign w:val="center"/>
+          </w:tcPr>
+          <w:p>
+            <w:pPr>
+              <w:spacing w:after="26" w:before="26" w:line="252" w:lineRule="auto"/>
+            </w:pPr>
+            <w:r>
+              <w:rPr>
+                <w:rFonts w:ascii="Calibri" w:cs="Calibri" w:eastAsia="Calibri" w:hAnsi="Calibri"/>
+                <w:b w:val="false"/>
+                <w:bCs w:val="false"/>
+                <w:i w:val="false"/>
+                <w:iCs w:val="false"/>
+                <w:sz w:val="17"/>
+                <w:szCs w:val="17"/>
+              </w:rPr>
+              <w:t xml:space="preserve">4 – 5</w:t>
+            </w:r>
+          </w:p>
+        </w:tc>
+        <w:tc>
+          <w:tcPr>
+            <w:tcW w:type="dxa" w:w="3896"/>
+            <w:shd w:fill="F6F8FC" w:color="auto" w:val="clear"/>
+            <w:tcMar>
+              <w:top w:type="dxa" w:w="60"/>
+              <w:left w:type="dxa" w:w="110"/>
+              <w:bottom w:type="dxa" w:w="60"/>
+              <w:right w:type="dxa" w:w="110"/>
+            </w:tcMar>
+            <w:vAlign w:val="center"/>
+          </w:tcPr>
+          <w:p>
+            <w:pPr>
+              <w:spacing w:after="26" w:before="26" w:line="252" w:lineRule="auto"/>
+            </w:pPr>
+            <w:r>
+              <w:rPr>
+                <w:rFonts w:ascii="Calibri" w:cs="Calibri" w:eastAsia="Calibri" w:hAnsi="Calibri"/>
+                <w:b w:val="false"/>
+                <w:bCs w:val="false"/>
+                <w:i w:val="false"/>
+                <w:iCs w:val="false"/>
+                <w:sz w:val="17"/>
+                <w:szCs w:val="17"/>
+              </w:rPr>
+              <w:t xml:space="preserve">Depends on the chain grade</w:t>
+            </w:r>
+          </w:p>
+        </w:tc>
+      </w:tr>
+      <w:tr>
+        <w:trPr>
+          <w:cantSplit/>
+        </w:trPr>
+        <w:tc>
+          <w:tcPr>
+            <w:tcW w:type="dxa" w:w="3896"/>
+            <w:shd w:fill="FFFFFF" w:color="auto" w:val="clear"/>
+            <w:tcMar>
+              <w:top w:type="dxa" w:w="60"/>
+              <w:left w:type="dxa" w:w="110"/>
+              <w:bottom w:type="dxa" w:w="60"/>
+              <w:right w:type="dxa" w:w="110"/>
+            </w:tcMar>
+            <w:vAlign w:val="center"/>
+          </w:tcPr>
+          <w:p>
+            <w:pPr>
+              <w:spacing w:after="26" w:before="26" w:line="252" w:lineRule="auto"/>
+            </w:pPr>
+            <w:r>
+              <w:rPr>
+                <w:rFonts w:ascii="Calibri" w:cs="Calibri" w:eastAsia="Calibri" w:hAnsi="Calibri"/>
+                <w:b w:val="false"/>
+                <w:bCs w:val="false"/>
+                <w:i w:val="false"/>
+                <w:iCs w:val="false"/>
+                <w:sz w:val="17"/>
+                <w:szCs w:val="17"/>
+              </w:rPr>
+              <w:t xml:space="preserve">Pins, shafts and load-carrying parts</w:t>
+            </w:r>
+          </w:p>
+        </w:tc>
+        <w:tc>
+          <w:tcPr>
+            <w:tcW w:type="dxa" w:w="1948"/>
+            <w:shd w:fill="FFFFFF" w:color="auto" w:val="clear"/>
+            <w:tcMar>
+              <w:top w:type="dxa" w:w="60"/>
+              <w:left w:type="dxa" w:w="110"/>
+              <w:bottom w:type="dxa" w:w="60"/>
+              <w:right w:type="dxa" w:w="110"/>
+            </w:tcMar>
+            <w:vAlign w:val="center"/>
+          </w:tcPr>
+          <w:p>
+            <w:pPr>
+              <w:spacing w:after="26" w:before="26" w:line="252" w:lineRule="auto"/>
+            </w:pPr>
+            <w:r>
+              <w:rPr>
+                <w:rFonts w:ascii="Calibri" w:cs="Calibri" w:eastAsia="Calibri" w:hAnsi="Calibri"/>
+                <w:b w:val="false"/>
+                <w:bCs w:val="false"/>
+                <w:i w:val="false"/>
+                <w:iCs w:val="false"/>
+                <w:sz w:val="17"/>
+                <w:szCs w:val="17"/>
+              </w:rPr>
+              <w:t xml:space="preserve">3 – 4 or more</w:t>
+            </w:r>
+          </w:p>
+        </w:tc>
+        <w:tc>
+          <w:tcPr>
+            <w:tcW w:type="dxa" w:w="3896"/>
+            <w:shd w:fill="FFFFFF" w:color="auto" w:val="clear"/>
+            <w:tcMar>
+              <w:top w:type="dxa" w:w="60"/>
+              <w:left w:type="dxa" w:w="110"/>
+              <w:bottom w:type="dxa" w:w="60"/>
+              <w:right w:type="dxa" w:w="110"/>
+            </w:tcMar>
+            <w:vAlign w:val="center"/>
+          </w:tcPr>
+          <w:p>
+            <w:pPr>
+              <w:spacing w:after="26" w:before="26" w:line="252" w:lineRule="auto"/>
+            </w:pPr>
+            <w:r>
+              <w:rPr>
+                <w:rFonts w:ascii="Calibri" w:cs="Calibri" w:eastAsia="Calibri" w:hAnsi="Calibri"/>
+                <w:b w:val="false"/>
+                <w:bCs w:val="false"/>
+                <w:i w:val="false"/>
+                <w:iCs w:val="false"/>
+                <w:sz w:val="17"/>
+                <w:szCs w:val="17"/>
+              </w:rPr>
+              <w:t xml:space="preserve">Higher under shock loading</w:t>
+            </w:r>
+          </w:p>
+        </w:tc>
+      </w:tr>
+    </w:tbl>
+    <w:p>
+      <w:pPr>
+        <w:spacing w:after="80" w:before="0"/>
+      </w:pPr>
+    </w:p>
+    <w:p>
+      <w:pPr>
+        <w:spacing w:after="150" w:before="0" w:line="340" w:lineRule="auto"/>
+        <w:ind w:left="140"/>
+      </w:pPr>
+      <w:r>
+        <w:rPr>
+          <w:rFonts w:ascii="Calibri" w:cs="Calibri" w:eastAsia="Calibri" w:hAnsi="Calibri"/>
+          <w:b w:val="false"/>
+          <w:bCs w:val="false"/>
+          <w:i w:val="false"/>
+          <w:iCs w:val="false"/>
+          <w:sz w:val="21"/>
+          <w:szCs w:val="21"/>
+        </w:rPr>
+        <w:t xml:space="preserve">For a specific problem, always </w:t>
+      </w:r>
+      <w:r>
+        <w:rPr>
+          <w:rFonts w:ascii="Calibri" w:cs="Calibri" w:eastAsia="Calibri" w:hAnsi="Calibri"/>
+          <w:b/>
+          <w:bCs/>
+          <w:i w:val="false"/>
+          <w:iCs w:val="false"/>
+          <w:sz w:val="21"/>
+          <w:szCs w:val="21"/>
+        </w:rPr>
+        <w:t xml:space="preserve">use the FOS stated in the question</w:t>
+      </w:r>
+      <w:r>
+        <w:rPr>
+          <w:rFonts w:ascii="Calibri" w:cs="Calibri" w:eastAsia="Calibri" w:hAnsi="Calibri"/>
+          <w:b w:val="false"/>
+          <w:bCs w:val="false"/>
+          <w:i w:val="false"/>
+          <w:iCs w:val="false"/>
+          <w:sz w:val="21"/>
+          <w:szCs w:val="21"/>
+        </w:rPr>
+        <w:t xml:space="preserve"> — for example FOS = 5 in Q8 and FOS = 30 in Q9 of this experiment.</w:t>
       </w:r>
     </w:p>
     <w:p>
       <w:pPr>
         <w:keepNext/>
-        <w:spacing w:after="40" w:before="160" w:line="276" w:lineRule="auto"/>
+        <w:spacing w:after="60" w:before="260" w:line="276" w:lineRule="auto"/>
       </w:pPr>
       <w:r>
         <w:rPr>
@@ -374,7 +1486,7 @@
     </w:p>
     <w:p>
       <w:pPr>
-        <w:spacing w:after="60" w:before="0" w:line="276" w:lineRule="auto"/>
+        <w:spacing w:after="150" w:before="0" w:line="340" w:lineRule="auto"/>
         <w:ind w:left="140"/>
       </w:pPr>
       <w:r>
@@ -387,61 +1499,348 @@
           <w:sz w:val="21"/>
           <w:szCs w:val="21"/>
         </w:rPr>
-        <w:t xml:space="preserve">The rope has </w:t>
-      </w:r>
-      <w:r>
-        <w:rPr>
-          <w:rFonts w:ascii="Calibri" w:cs="Calibri" w:eastAsia="Calibri" w:hAnsi="Calibri"/>
-          <w:b/>
-          <w:bCs/>
-          <w:i w:val="false"/>
-          <w:iCs w:val="false"/>
-          <w:sz w:val="21"/>
-          <w:szCs w:val="21"/>
-        </w:rPr>
-        <w:t xml:space="preserve">6 strands around a central core</w:t>
-      </w:r>
-      <w:r>
-        <w:rPr>
-          <w:rFonts w:ascii="Calibri" w:cs="Calibri" w:eastAsia="Calibri" w:hAnsi="Calibri"/>
-          <w:b w:val="false"/>
-          <w:bCs w:val="false"/>
-          <w:i w:val="false"/>
-          <w:iCs w:val="false"/>
-          <w:sz w:val="21"/>
-          <w:szCs w:val="21"/>
-        </w:rPr>
-        <w:t xml:space="preserve">; each strand has </w:t>
-      </w:r>
-      <w:r>
-        <w:rPr>
-          <w:rFonts w:ascii="Calibri" w:cs="Calibri" w:eastAsia="Calibri" w:hAnsi="Calibri"/>
-          <w:b/>
-          <w:bCs/>
-          <w:i w:val="false"/>
-          <w:iCs w:val="false"/>
-          <w:sz w:val="21"/>
-          <w:szCs w:val="21"/>
-        </w:rPr>
-        <w:t xml:space="preserve">19 steel wires</w:t>
-      </w:r>
-      <w:r>
-        <w:rPr>
-          <w:rFonts w:ascii="Calibri" w:cs="Calibri" w:eastAsia="Calibri" w:hAnsi="Calibri"/>
-          <w:b w:val="false"/>
-          <w:bCs w:val="false"/>
-          <w:i w:val="false"/>
-          <w:iCs w:val="false"/>
-          <w:sz w:val="21"/>
-          <w:szCs w:val="21"/>
-        </w:rPr>
-        <w:t xml:space="preserve"> (one centre + 9 + 9). The core is usually a fibre core (FC — soft, holds lubricant) or an independent wire rope core (IWRC — stronger, for heat). "6 × 19" is the most common general-purpose crane rope — flexible and reasonably strong.</w:t>
+        <w:t xml:space="preserve">A steel wire rope is built up from very thin, high-carbon-steel wires arranged in several twisted layers so that it is both strong and flexible. The designation "6 × 19" describes exactly how the wires are grouped:</w:t>
+      </w:r>
+    </w:p>
+    <w:p>
+      <w:pPr>
+        <w:spacing w:after="60" w:before="60" w:line="320" w:lineRule="auto"/>
+        <w:ind w:left="480" w:hanging="200"/>
+      </w:pPr>
+      <w:r>
+        <w:rPr>
+          <w:rFonts w:ascii="Calibri" w:cs="Calibri" w:eastAsia="Calibri" w:hAnsi="Calibri"/>
+          <w:b/>
+          <w:bCs/>
+          <w:i w:val="false"/>
+          <w:iCs w:val="false"/>
+          <w:color w:val="1F3864"/>
+          <w:sz w:val="21"/>
+          <w:szCs w:val="21"/>
+        </w:rPr>
+        <w:t xml:space="preserve">• </w:t>
+      </w:r>
+      <w:r>
+        <w:rPr>
+          <w:rFonts w:ascii="Calibri" w:cs="Calibri" w:eastAsia="Calibri" w:hAnsi="Calibri"/>
+          <w:b/>
+          <w:bCs/>
+          <w:i w:val="false"/>
+          <w:iCs w:val="false"/>
+          <w:sz w:val="21"/>
+          <w:szCs w:val="21"/>
+        </w:rPr>
+        <w:t xml:space="preserve">6 strands</w:t>
+      </w:r>
+      <w:r>
+        <w:rPr>
+          <w:rFonts w:ascii="Calibri" w:cs="Calibri" w:eastAsia="Calibri" w:hAnsi="Calibri"/>
+          <w:b w:val="false"/>
+          <w:bCs w:val="false"/>
+          <w:i w:val="false"/>
+          <w:iCs w:val="false"/>
+          <w:sz w:val="21"/>
+          <w:szCs w:val="21"/>
+        </w:rPr>
+        <w:t xml:space="preserve"> are wound in a helix around a central </w:t>
+      </w:r>
+      <w:r>
+        <w:rPr>
+          <w:rFonts w:ascii="Calibri" w:cs="Calibri" w:eastAsia="Calibri" w:hAnsi="Calibri"/>
+          <w:b/>
+          <w:bCs/>
+          <w:i w:val="false"/>
+          <w:iCs w:val="false"/>
+          <w:sz w:val="21"/>
+          <w:szCs w:val="21"/>
+        </w:rPr>
+        <w:t xml:space="preserve">core</w:t>
+      </w:r>
+      <w:r>
+        <w:rPr>
+          <w:rFonts w:ascii="Calibri" w:cs="Calibri" w:eastAsia="Calibri" w:hAnsi="Calibri"/>
+          <w:b w:val="false"/>
+          <w:bCs w:val="false"/>
+          <w:i w:val="false"/>
+          <w:iCs w:val="false"/>
+          <w:sz w:val="21"/>
+          <w:szCs w:val="21"/>
+        </w:rPr>
+        <w:t xml:space="preserve"> (so the "6" in 6 × 19 is the number of outer strands you see on the outside of the rope).</w:t>
+      </w:r>
+    </w:p>
+    <w:p>
+      <w:pPr>
+        <w:spacing w:after="60" w:before="60" w:line="320" w:lineRule="auto"/>
+        <w:ind w:left="480" w:hanging="200"/>
+      </w:pPr>
+      <w:r>
+        <w:rPr>
+          <w:rFonts w:ascii="Calibri" w:cs="Calibri" w:eastAsia="Calibri" w:hAnsi="Calibri"/>
+          <w:b/>
+          <w:bCs/>
+          <w:i w:val="false"/>
+          <w:iCs w:val="false"/>
+          <w:color w:val="1F3864"/>
+          <w:sz w:val="21"/>
+          <w:szCs w:val="21"/>
+        </w:rPr>
+        <w:t xml:space="preserve">• </w:t>
+      </w:r>
+      <w:r>
+        <w:rPr>
+          <w:rFonts w:ascii="Calibri" w:cs="Calibri" w:eastAsia="Calibri" w:hAnsi="Calibri"/>
+          <w:b/>
+          <w:bCs/>
+          <w:i w:val="false"/>
+          <w:iCs w:val="false"/>
+          <w:sz w:val="21"/>
+          <w:szCs w:val="21"/>
+        </w:rPr>
+        <w:t xml:space="preserve">Each strand has 19 steel wires</w:t>
+      </w:r>
+      <w:r>
+        <w:rPr>
+          <w:rFonts w:ascii="Calibri" w:cs="Calibri" w:eastAsia="Calibri" w:hAnsi="Calibri"/>
+          <w:b w:val="false"/>
+          <w:bCs w:val="false"/>
+          <w:i w:val="false"/>
+          <w:iCs w:val="false"/>
+          <w:sz w:val="21"/>
+          <w:szCs w:val="21"/>
+        </w:rPr>
+        <w:t xml:space="preserve"> laid out in three layers: 1 centre wire + 9 inner wires + 9 outer wires (sometimes written as 1 + 9 + 9).</w:t>
+      </w:r>
+    </w:p>
+    <w:p>
+      <w:pPr>
+        <w:spacing w:after="60" w:before="60" w:line="320" w:lineRule="auto"/>
+        <w:ind w:left="480" w:hanging="200"/>
+      </w:pPr>
+      <w:r>
+        <w:rPr>
+          <w:rFonts w:ascii="Calibri" w:cs="Calibri" w:eastAsia="Calibri" w:hAnsi="Calibri"/>
+          <w:b/>
+          <w:bCs/>
+          <w:i w:val="false"/>
+          <w:iCs w:val="false"/>
+          <w:color w:val="1F3864"/>
+          <w:sz w:val="21"/>
+          <w:szCs w:val="21"/>
+        </w:rPr>
+        <w:t xml:space="preserve">• </w:t>
+      </w:r>
+      <w:r>
+        <w:rPr>
+          <w:rFonts w:ascii="Calibri" w:cs="Calibri" w:eastAsia="Calibri" w:hAnsi="Calibri"/>
+          <w:b w:val="false"/>
+          <w:bCs w:val="false"/>
+          <w:i w:val="false"/>
+          <w:iCs w:val="false"/>
+          <w:sz w:val="21"/>
+          <w:szCs w:val="21"/>
+        </w:rPr>
+        <w:t xml:space="preserve">The </w:t>
+      </w:r>
+      <w:r>
+        <w:rPr>
+          <w:rFonts w:ascii="Calibri" w:cs="Calibri" w:eastAsia="Calibri" w:hAnsi="Calibri"/>
+          <w:b/>
+          <w:bCs/>
+          <w:i w:val="false"/>
+          <w:iCs w:val="false"/>
+          <w:sz w:val="21"/>
+          <w:szCs w:val="21"/>
+        </w:rPr>
+        <w:t xml:space="preserve">core</w:t>
+      </w:r>
+      <w:r>
+        <w:rPr>
+          <w:rFonts w:ascii="Calibri" w:cs="Calibri" w:eastAsia="Calibri" w:hAnsi="Calibri"/>
+          <w:b w:val="false"/>
+          <w:bCs w:val="false"/>
+          <w:i w:val="false"/>
+          <w:iCs w:val="false"/>
+          <w:sz w:val="21"/>
+          <w:szCs w:val="21"/>
+        </w:rPr>
+        <w:t xml:space="preserve"> is of two common types:  </w:t>
+      </w:r>
+      <w:r>
+        <w:rPr>
+          <w:rFonts w:ascii="Calibri" w:cs="Calibri" w:eastAsia="Calibri" w:hAnsi="Calibri"/>
+          <w:b/>
+          <w:bCs/>
+          <w:i w:val="false"/>
+          <w:iCs w:val="false"/>
+          <w:sz w:val="21"/>
+          <w:szCs w:val="21"/>
+        </w:rPr>
+        <w:t xml:space="preserve">Fibre Core (FC)</w:t>
+      </w:r>
+      <w:r>
+        <w:rPr>
+          <w:rFonts w:ascii="Calibri" w:cs="Calibri" w:eastAsia="Calibri" w:hAnsi="Calibri"/>
+          <w:b w:val="false"/>
+          <w:bCs w:val="false"/>
+          <w:i w:val="false"/>
+          <w:iCs w:val="false"/>
+          <w:sz w:val="21"/>
+          <w:szCs w:val="21"/>
+        </w:rPr>
+        <w:t xml:space="preserve"> — natural or synthetic fibre; soft, holds lubricant and gives flexibility — or </w:t>
+      </w:r>
+      <w:r>
+        <w:rPr>
+          <w:rFonts w:ascii="Calibri" w:cs="Calibri" w:eastAsia="Calibri" w:hAnsi="Calibri"/>
+          <w:b/>
+          <w:bCs/>
+          <w:i w:val="false"/>
+          <w:iCs w:val="false"/>
+          <w:sz w:val="21"/>
+          <w:szCs w:val="21"/>
+        </w:rPr>
+        <w:t xml:space="preserve">Independent Wire Rope Core (IWRC)</w:t>
+      </w:r>
+      <w:r>
+        <w:rPr>
+          <w:rFonts w:ascii="Calibri" w:cs="Calibri" w:eastAsia="Calibri" w:hAnsi="Calibri"/>
+          <w:b w:val="false"/>
+          <w:bCs w:val="false"/>
+          <w:i w:val="false"/>
+          <w:iCs w:val="false"/>
+          <w:sz w:val="21"/>
+          <w:szCs w:val="21"/>
+        </w:rPr>
+        <w:t xml:space="preserve"> — a small 7 × 7 wire rope used as a core; stronger, used where crushing or heat is a problem.</w:t>
+      </w:r>
+    </w:p>
+    <w:p>
+      <w:pPr>
+        <w:spacing w:after="60" w:before="60" w:line="320" w:lineRule="auto"/>
+        <w:ind w:left="480" w:hanging="200"/>
+      </w:pPr>
+      <w:r>
+        <w:rPr>
+          <w:rFonts w:ascii="Calibri" w:cs="Calibri" w:eastAsia="Calibri" w:hAnsi="Calibri"/>
+          <w:b/>
+          <w:bCs/>
+          <w:i w:val="false"/>
+          <w:iCs w:val="false"/>
+          <w:color w:val="1F3864"/>
+          <w:sz w:val="21"/>
+          <w:szCs w:val="21"/>
+        </w:rPr>
+        <w:t xml:space="preserve">• </w:t>
+      </w:r>
+      <w:r>
+        <w:rPr>
+          <w:rFonts w:ascii="Calibri" w:cs="Calibri" w:eastAsia="Calibri" w:hAnsi="Calibri"/>
+          <w:b/>
+          <w:bCs/>
+          <w:i w:val="false"/>
+          <w:iCs w:val="false"/>
+          <w:sz w:val="21"/>
+          <w:szCs w:val="21"/>
+        </w:rPr>
+        <w:t xml:space="preserve">Right-hand (RH) ordinary lay</w:t>
+      </w:r>
+      <w:r>
+        <w:rPr>
+          <w:rFonts w:ascii="Calibri" w:cs="Calibri" w:eastAsia="Calibri" w:hAnsi="Calibri"/>
+          <w:b w:val="false"/>
+          <w:bCs w:val="false"/>
+          <w:i w:val="false"/>
+          <w:iCs w:val="false"/>
+          <w:sz w:val="21"/>
+          <w:szCs w:val="21"/>
+        </w:rPr>
+        <w:t xml:space="preserve"> is the most common: outer strands are twisted right-handed, and the wires within each strand are twisted the opposite way, which stops the rope from twisting under load.</w:t>
+      </w:r>
+    </w:p>
+    <w:p>
+      <w:pPr>
+        <w:spacing w:after="60" w:before="60" w:line="320" w:lineRule="auto"/>
+        <w:ind w:left="480" w:hanging="200"/>
+      </w:pPr>
+      <w:r>
+        <w:rPr>
+          <w:rFonts w:ascii="Calibri" w:cs="Calibri" w:eastAsia="Calibri" w:hAnsi="Calibri"/>
+          <w:b/>
+          <w:bCs/>
+          <w:i w:val="false"/>
+          <w:iCs w:val="false"/>
+          <w:color w:val="1F3864"/>
+          <w:sz w:val="21"/>
+          <w:szCs w:val="21"/>
+        </w:rPr>
+        <w:t xml:space="preserve">• </w:t>
+      </w:r>
+      <w:r>
+        <w:rPr>
+          <w:rFonts w:ascii="Calibri" w:cs="Calibri" w:eastAsia="Calibri" w:hAnsi="Calibri"/>
+          <w:b w:val="false"/>
+          <w:bCs w:val="false"/>
+          <w:i w:val="false"/>
+          <w:iCs w:val="false"/>
+          <w:sz w:val="21"/>
+          <w:szCs w:val="21"/>
+        </w:rPr>
+        <w:t xml:space="preserve">The high-tensile wires are usually of </w:t>
+      </w:r>
+      <w:r>
+        <w:rPr>
+          <w:rFonts w:ascii="Calibri" w:cs="Calibri" w:eastAsia="Calibri" w:hAnsi="Calibri"/>
+          <w:b/>
+          <w:bCs/>
+          <w:i w:val="false"/>
+          <w:iCs w:val="false"/>
+          <w:sz w:val="21"/>
+          <w:szCs w:val="21"/>
+        </w:rPr>
+        <w:t xml:space="preserve">1570 N/mm² or 1770 N/mm²</w:t>
+      </w:r>
+      <w:r>
+        <w:rPr>
+          <w:rFonts w:ascii="Calibri" w:cs="Calibri" w:eastAsia="Calibri" w:hAnsi="Calibri"/>
+          <w:b w:val="false"/>
+          <w:bCs w:val="false"/>
+          <w:i w:val="false"/>
+          <w:iCs w:val="false"/>
+          <w:sz w:val="21"/>
+          <w:szCs w:val="21"/>
+        </w:rPr>
+        <w:t xml:space="preserve"> grade, often </w:t>
+      </w:r>
+      <w:r>
+        <w:rPr>
+          <w:rFonts w:ascii="Calibri" w:cs="Calibri" w:eastAsia="Calibri" w:hAnsi="Calibri"/>
+          <w:b/>
+          <w:bCs/>
+          <w:i w:val="false"/>
+          <w:iCs w:val="false"/>
+          <w:sz w:val="21"/>
+          <w:szCs w:val="21"/>
+        </w:rPr>
+        <w:t xml:space="preserve">galvanised</w:t>
+      </w:r>
+      <w:r>
+        <w:rPr>
+          <w:rFonts w:ascii="Calibri" w:cs="Calibri" w:eastAsia="Calibri" w:hAnsi="Calibri"/>
+          <w:b w:val="false"/>
+          <w:bCs w:val="false"/>
+          <w:i w:val="false"/>
+          <w:iCs w:val="false"/>
+          <w:sz w:val="21"/>
+          <w:szCs w:val="21"/>
+        </w:rPr>
+        <w:t xml:space="preserve"> to resist corrosion. 6 × 19 is the most common general-purpose crane and hoist rope — flexible enough for small sheaves and still carrying high load.</w:t>
       </w:r>
     </w:p>
     <w:p>
       <w:pPr>
         <w:keepNext/>
-        <w:spacing w:after="40" w:before="160" w:line="276" w:lineRule="auto"/>
+        <w:spacing w:after="60" w:before="260" w:line="276" w:lineRule="auto"/>
       </w:pPr>
       <w:r>
         <w:rPr>
@@ -471,7 +1870,7 @@
     </w:p>
     <w:p>
       <w:pPr>
-        <w:spacing w:after="60" w:before="0" w:line="276" w:lineRule="auto"/>
+        <w:spacing w:after="150" w:before="0" w:line="340" w:lineRule="auto"/>
         <w:ind w:left="140"/>
       </w:pPr>
       <w:r>
@@ -484,8 +1883,14 @@
           <w:sz w:val="21"/>
           <w:szCs w:val="21"/>
         </w:rPr>
-        <w:t xml:space="preserve">A rope is written as:  </w:t>
-      </w:r>
+        <w:t xml:space="preserve">A rope is written in a standard order so that any maker, inspector or user understands exactly what is being specified:</w:t>
+      </w:r>
+    </w:p>
+    <w:p>
+      <w:pPr>
+        <w:spacing w:after="150" w:before="0" w:line="340" w:lineRule="auto"/>
+        <w:ind w:left="140"/>
+      </w:pPr>
       <w:r>
         <w:rPr>
           <w:rFonts w:ascii="Calibri" w:cs="Calibri" w:eastAsia="Calibri" w:hAnsi="Calibri"/>
@@ -498,18 +1903,30 @@
         </w:rPr>
         <w:t xml:space="preserve">nominal diameter (mm) × construction × core × tensile grade × lay × finish × standard</w:t>
       </w:r>
-      <w:r>
-        <w:rPr>
-          <w:rFonts w:ascii="Calibri" w:cs="Calibri" w:eastAsia="Calibri" w:hAnsi="Calibri"/>
-          <w:b w:val="false"/>
-          <w:bCs w:val="false"/>
-          <w:i w:val="false"/>
-          <w:iCs w:val="false"/>
-          <w:sz w:val="21"/>
-          <w:szCs w:val="21"/>
-        </w:rPr>
-        <w:t xml:space="preserve">. Example: </w:t>
-      </w:r>
+    </w:p>
+    <w:p>
+      <w:pPr>
+        <w:spacing w:after="150" w:before="0" w:line="340" w:lineRule="auto"/>
+        <w:ind w:left="140"/>
+      </w:pPr>
+      <w:r>
+        <w:rPr>
+          <w:rFonts w:ascii="Calibri" w:cs="Calibri" w:eastAsia="Calibri" w:hAnsi="Calibri"/>
+          <w:b w:val="false"/>
+          <w:bCs w:val="false"/>
+          <w:i w:val="false"/>
+          <w:iCs w:val="false"/>
+          <w:sz w:val="21"/>
+          <w:szCs w:val="21"/>
+        </w:rPr>
+        <w:t xml:space="preserve">A typical example for a general crane rope:</w:t>
+      </w:r>
+    </w:p>
+    <w:p>
+      <w:pPr>
+        <w:spacing w:after="150" w:before="0" w:line="340" w:lineRule="auto"/>
+        <w:ind w:left="140"/>
+      </w:pPr>
       <w:r>
         <w:rPr>
           <w:rFonts w:ascii="Consolas" w:cs="Consolas" w:eastAsia="Consolas" w:hAnsi="Consolas"/>
@@ -520,25 +1937,199 @@
           <w:sz w:val="19"/>
           <w:szCs w:val="19"/>
         </w:rPr>
-        <w:t xml:space="preserve">18 mm 6×19 FC 1770 N/mm² RH ordinary lay galvanised IS 2266</w:t>
-      </w:r>
-      <w:r>
-        <w:rPr>
-          <w:rFonts w:ascii="Calibri" w:cs="Calibri" w:eastAsia="Calibri" w:hAnsi="Calibri"/>
-          <w:b w:val="false"/>
-          <w:bCs w:val="false"/>
-          <w:i w:val="false"/>
-          <w:iCs w:val="false"/>
-          <w:sz w:val="21"/>
-          <w:szCs w:val="21"/>
-        </w:rPr>
-        <w:t xml:space="preserve">.</w:t>
+        <w:t xml:space="preserve">18 mm  ·  6 × 19  ·  FC  ·  1770 N/mm²  ·  Right-hand ordinary lay  ·  galvanised  ·  IS 2266</w:t>
+      </w:r>
+    </w:p>
+    <w:p>
+      <w:pPr>
+        <w:spacing w:after="150" w:before="0" w:line="340" w:lineRule="auto"/>
+        <w:ind w:left="140"/>
+      </w:pPr>
+      <w:r>
+        <w:rPr>
+          <w:rFonts w:ascii="Calibri" w:cs="Calibri" w:eastAsia="Calibri" w:hAnsi="Calibri"/>
+          <w:b w:val="false"/>
+          <w:bCs w:val="false"/>
+          <w:i w:val="false"/>
+          <w:iCs w:val="false"/>
+          <w:sz w:val="21"/>
+          <w:szCs w:val="21"/>
+        </w:rPr>
+        <w:t xml:space="preserve">Meaning of each item:  </w:t>
+      </w:r>
+      <w:r>
+        <w:rPr>
+          <w:rFonts w:ascii="Calibri" w:cs="Calibri" w:eastAsia="Calibri" w:hAnsi="Calibri"/>
+          <w:b/>
+          <w:bCs/>
+          <w:i w:val="false"/>
+          <w:iCs w:val="false"/>
+          <w:sz w:val="21"/>
+          <w:szCs w:val="21"/>
+        </w:rPr>
+        <w:t xml:space="preserve">18 mm</w:t>
+      </w:r>
+      <w:r>
+        <w:rPr>
+          <w:rFonts w:ascii="Calibri" w:cs="Calibri" w:eastAsia="Calibri" w:hAnsi="Calibri"/>
+          <w:b w:val="false"/>
+          <w:bCs w:val="false"/>
+          <w:i w:val="false"/>
+          <w:iCs w:val="false"/>
+          <w:sz w:val="21"/>
+          <w:szCs w:val="21"/>
+        </w:rPr>
+        <w:t xml:space="preserve"> = nominal rope diameter;  </w:t>
+      </w:r>
+      <w:r>
+        <w:rPr>
+          <w:rFonts w:ascii="Calibri" w:cs="Calibri" w:eastAsia="Calibri" w:hAnsi="Calibri"/>
+          <w:b/>
+          <w:bCs/>
+          <w:i w:val="false"/>
+          <w:iCs w:val="false"/>
+          <w:sz w:val="21"/>
+          <w:szCs w:val="21"/>
+        </w:rPr>
+        <w:t xml:space="preserve">6 × 19</w:t>
+      </w:r>
+      <w:r>
+        <w:rPr>
+          <w:rFonts w:ascii="Calibri" w:cs="Calibri" w:eastAsia="Calibri" w:hAnsi="Calibri"/>
+          <w:b w:val="false"/>
+          <w:bCs w:val="false"/>
+          <w:i w:val="false"/>
+          <w:iCs w:val="false"/>
+          <w:sz w:val="21"/>
+          <w:szCs w:val="21"/>
+        </w:rPr>
+        <w:t xml:space="preserve"> = construction (6 strands of 19 wires);  </w:t>
+      </w:r>
+      <w:r>
+        <w:rPr>
+          <w:rFonts w:ascii="Calibri" w:cs="Calibri" w:eastAsia="Calibri" w:hAnsi="Calibri"/>
+          <w:b/>
+          <w:bCs/>
+          <w:i w:val="false"/>
+          <w:iCs w:val="false"/>
+          <w:sz w:val="21"/>
+          <w:szCs w:val="21"/>
+        </w:rPr>
+        <w:t xml:space="preserve">FC</w:t>
+      </w:r>
+      <w:r>
+        <w:rPr>
+          <w:rFonts w:ascii="Calibri" w:cs="Calibri" w:eastAsia="Calibri" w:hAnsi="Calibri"/>
+          <w:b w:val="false"/>
+          <w:bCs w:val="false"/>
+          <w:i w:val="false"/>
+          <w:iCs w:val="false"/>
+          <w:sz w:val="21"/>
+          <w:szCs w:val="21"/>
+        </w:rPr>
+        <w:t xml:space="preserve"> = Fibre Core;  </w:t>
+      </w:r>
+      <w:r>
+        <w:rPr>
+          <w:rFonts w:ascii="Calibri" w:cs="Calibri" w:eastAsia="Calibri" w:hAnsi="Calibri"/>
+          <w:b/>
+          <w:bCs/>
+          <w:i w:val="false"/>
+          <w:iCs w:val="false"/>
+          <w:sz w:val="21"/>
+          <w:szCs w:val="21"/>
+        </w:rPr>
+        <w:t xml:space="preserve">1770 N/mm²</w:t>
+      </w:r>
+      <w:r>
+        <w:rPr>
+          <w:rFonts w:ascii="Calibri" w:cs="Calibri" w:eastAsia="Calibri" w:hAnsi="Calibri"/>
+          <w:b w:val="false"/>
+          <w:bCs w:val="false"/>
+          <w:i w:val="false"/>
+          <w:iCs w:val="false"/>
+          <w:sz w:val="21"/>
+          <w:szCs w:val="21"/>
+        </w:rPr>
+        <w:t xml:space="preserve"> = ultimate tensile strength of the wires;  </w:t>
+      </w:r>
+      <w:r>
+        <w:rPr>
+          <w:rFonts w:ascii="Calibri" w:cs="Calibri" w:eastAsia="Calibri" w:hAnsi="Calibri"/>
+          <w:b/>
+          <w:bCs/>
+          <w:i w:val="false"/>
+          <w:iCs w:val="false"/>
+          <w:sz w:val="21"/>
+          <w:szCs w:val="21"/>
+        </w:rPr>
+        <w:t xml:space="preserve">RH ordinary lay</w:t>
+      </w:r>
+      <w:r>
+        <w:rPr>
+          <w:rFonts w:ascii="Calibri" w:cs="Calibri" w:eastAsia="Calibri" w:hAnsi="Calibri"/>
+          <w:b w:val="false"/>
+          <w:bCs w:val="false"/>
+          <w:i w:val="false"/>
+          <w:iCs w:val="false"/>
+          <w:sz w:val="21"/>
+          <w:szCs w:val="21"/>
+        </w:rPr>
+        <w:t xml:space="preserve"> = strands twisted right-hand with wires in each strand twisted the opposite way;  </w:t>
+      </w:r>
+      <w:r>
+        <w:rPr>
+          <w:rFonts w:ascii="Calibri" w:cs="Calibri" w:eastAsia="Calibri" w:hAnsi="Calibri"/>
+          <w:b/>
+          <w:bCs/>
+          <w:i w:val="false"/>
+          <w:iCs w:val="false"/>
+          <w:sz w:val="21"/>
+          <w:szCs w:val="21"/>
+        </w:rPr>
+        <w:t xml:space="preserve">galvanised</w:t>
+      </w:r>
+      <w:r>
+        <w:rPr>
+          <w:rFonts w:ascii="Calibri" w:cs="Calibri" w:eastAsia="Calibri" w:hAnsi="Calibri"/>
+          <w:b w:val="false"/>
+          <w:bCs w:val="false"/>
+          <w:i w:val="false"/>
+          <w:iCs w:val="false"/>
+          <w:sz w:val="21"/>
+          <w:szCs w:val="21"/>
+        </w:rPr>
+        <w:t xml:space="preserve"> = zinc-coated for corrosion protection;  </w:t>
+      </w:r>
+      <w:r>
+        <w:rPr>
+          <w:rFonts w:ascii="Calibri" w:cs="Calibri" w:eastAsia="Calibri" w:hAnsi="Calibri"/>
+          <w:b/>
+          <w:bCs/>
+          <w:i w:val="false"/>
+          <w:iCs w:val="false"/>
+          <w:sz w:val="21"/>
+          <w:szCs w:val="21"/>
+        </w:rPr>
+        <w:t xml:space="preserve">IS 2266</w:t>
+      </w:r>
+      <w:r>
+        <w:rPr>
+          <w:rFonts w:ascii="Calibri" w:cs="Calibri" w:eastAsia="Calibri" w:hAnsi="Calibri"/>
+          <w:b w:val="false"/>
+          <w:bCs w:val="false"/>
+          <w:i w:val="false"/>
+          <w:iCs w:val="false"/>
+          <w:sz w:val="21"/>
+          <w:szCs w:val="21"/>
+        </w:rPr>
+        <w:t xml:space="preserve"> = Indian Standard the rope is made and tested to.</w:t>
       </w:r>
     </w:p>
     <w:p>
       <w:pPr>
         <w:keepNext/>
-        <w:spacing w:after="40" w:before="160" w:line="276" w:lineRule="auto"/>
+        <w:spacing w:after="60" w:before="260" w:line="276" w:lineRule="auto"/>
       </w:pPr>
       <w:r>
         <w:rPr>
@@ -568,7 +2159,7 @@
     </w:p>
     <w:p>
       <w:pPr>
-        <w:spacing w:after="60" w:before="0" w:line="276" w:lineRule="auto"/>
+        <w:spacing w:after="150" w:before="0" w:line="340" w:lineRule="auto"/>
         <w:ind w:left="140"/>
       </w:pPr>
       <w:r>
@@ -581,13 +2172,434 @@
           <w:sz w:val="21"/>
           <w:szCs w:val="21"/>
         </w:rPr>
-        <w:t xml:space="preserve">Pick the rope by the load and shock conditions, the sheave/drum diameter (D ≥ 20–40 d), the environment (water, heat, dust → IWRC / galvanised), the required flexibility (more wires = more flexible), and the applicable code (IS 2266). Use the correct FOS and keep the rope length and bending radius within recommended limits.</w:t>
+        <w:t xml:space="preserve">Picking a wire rope is not just about the load — several things decide the final choice. The common guidelines, taken from IS 2266, IS 2365 and the equipment code of practice, are:</w:t>
+      </w:r>
+    </w:p>
+    <w:p>
+      <w:pPr>
+        <w:spacing w:after="60" w:before="60" w:line="320" w:lineRule="auto"/>
+        <w:ind w:left="480" w:hanging="200"/>
+      </w:pPr>
+      <w:r>
+        <w:rPr>
+          <w:rFonts w:ascii="Calibri" w:cs="Calibri" w:eastAsia="Calibri" w:hAnsi="Calibri"/>
+          <w:b/>
+          <w:bCs/>
+          <w:i w:val="false"/>
+          <w:iCs w:val="false"/>
+          <w:color w:val="1F3864"/>
+          <w:sz w:val="21"/>
+          <w:szCs w:val="21"/>
+        </w:rPr>
+        <w:t xml:space="preserve">• </w:t>
+      </w:r>
+      <w:r>
+        <w:rPr>
+          <w:rFonts w:ascii="Calibri" w:cs="Calibri" w:eastAsia="Calibri" w:hAnsi="Calibri"/>
+          <w:b/>
+          <w:bCs/>
+          <w:i w:val="false"/>
+          <w:iCs w:val="false"/>
+          <w:sz w:val="21"/>
+          <w:szCs w:val="21"/>
+        </w:rPr>
+        <w:t xml:space="preserve">Load class and shock.</w:t>
+      </w:r>
+      <w:r>
+        <w:rPr>
+          <w:rFonts w:ascii="Calibri" w:cs="Calibri" w:eastAsia="Calibri" w:hAnsi="Calibri"/>
+          <w:b w:val="false"/>
+          <w:bCs w:val="false"/>
+          <w:i w:val="false"/>
+          <w:iCs w:val="false"/>
+          <w:sz w:val="21"/>
+          <w:szCs w:val="21"/>
+        </w:rPr>
+        <w:t xml:space="preserve"> Decide whether the duty is light, medium, heavy or very heavy and apply the appropriate </w:t>
+      </w:r>
+      <w:r>
+        <w:rPr>
+          <w:rFonts w:ascii="Calibri" w:cs="Calibri" w:eastAsia="Calibri" w:hAnsi="Calibri"/>
+          <w:b/>
+          <w:bCs/>
+          <w:i w:val="false"/>
+          <w:iCs w:val="false"/>
+          <w:sz w:val="21"/>
+          <w:szCs w:val="21"/>
+        </w:rPr>
+        <w:t xml:space="preserve">factor of safety</w:t>
+      </w:r>
+      <w:r>
+        <w:rPr>
+          <w:rFonts w:ascii="Calibri" w:cs="Calibri" w:eastAsia="Calibri" w:hAnsi="Calibri"/>
+          <w:b w:val="false"/>
+          <w:bCs w:val="false"/>
+          <w:i w:val="false"/>
+          <w:iCs w:val="false"/>
+          <w:sz w:val="21"/>
+          <w:szCs w:val="21"/>
+        </w:rPr>
+        <w:t xml:space="preserve"> (5 – 12 as shown in Q3).</w:t>
+      </w:r>
+    </w:p>
+    <w:p>
+      <w:pPr>
+        <w:spacing w:after="60" w:before="60" w:line="320" w:lineRule="auto"/>
+        <w:ind w:left="480" w:hanging="200"/>
+      </w:pPr>
+      <w:r>
+        <w:rPr>
+          <w:rFonts w:ascii="Calibri" w:cs="Calibri" w:eastAsia="Calibri" w:hAnsi="Calibri"/>
+          <w:b/>
+          <w:bCs/>
+          <w:i w:val="false"/>
+          <w:iCs w:val="false"/>
+          <w:color w:val="1F3864"/>
+          <w:sz w:val="21"/>
+          <w:szCs w:val="21"/>
+        </w:rPr>
+        <w:t xml:space="preserve">• </w:t>
+      </w:r>
+      <w:r>
+        <w:rPr>
+          <w:rFonts w:ascii="Calibri" w:cs="Calibri" w:eastAsia="Calibri" w:hAnsi="Calibri"/>
+          <w:b/>
+          <w:bCs/>
+          <w:i w:val="false"/>
+          <w:iCs w:val="false"/>
+          <w:sz w:val="21"/>
+          <w:szCs w:val="21"/>
+        </w:rPr>
+        <w:t xml:space="preserve">Sheave and drum diameter.</w:t>
+      </w:r>
+      <w:r>
+        <w:rPr>
+          <w:rFonts w:ascii="Calibri" w:cs="Calibri" w:eastAsia="Calibri" w:hAnsi="Calibri"/>
+          <w:b w:val="false"/>
+          <w:bCs w:val="false"/>
+          <w:i w:val="false"/>
+          <w:iCs w:val="false"/>
+          <w:sz w:val="21"/>
+          <w:szCs w:val="21"/>
+        </w:rPr>
+        <w:t xml:space="preserve"> Keep </w:t>
+      </w:r>
+      <w:r>
+        <w:rPr>
+          <w:rFonts w:ascii="Calibri" w:cs="Calibri" w:eastAsia="Calibri" w:hAnsi="Calibri"/>
+          <w:b/>
+          <w:bCs/>
+          <w:i w:val="false"/>
+          <w:iCs w:val="false"/>
+          <w:sz w:val="21"/>
+          <w:szCs w:val="21"/>
+        </w:rPr>
+        <w:t xml:space="preserve">D / d ≥ 20 – 40</w:t>
+      </w:r>
+      <w:r>
+        <w:rPr>
+          <w:rFonts w:ascii="Calibri" w:cs="Calibri" w:eastAsia="Calibri" w:hAnsi="Calibri"/>
+          <w:b w:val="false"/>
+          <w:bCs w:val="false"/>
+          <w:i w:val="false"/>
+          <w:iCs w:val="false"/>
+          <w:sz w:val="21"/>
+          <w:szCs w:val="21"/>
+        </w:rPr>
+        <w:t xml:space="preserve"> so the wires do not bend too sharply; a bigger D/d means fewer bending stress cycles and a longer rope life. Mine and lift ropes use the higher values.</w:t>
+      </w:r>
+    </w:p>
+    <w:p>
+      <w:pPr>
+        <w:spacing w:after="60" w:before="60" w:line="320" w:lineRule="auto"/>
+        <w:ind w:left="480" w:hanging="200"/>
+      </w:pPr>
+      <w:r>
+        <w:rPr>
+          <w:rFonts w:ascii="Calibri" w:cs="Calibri" w:eastAsia="Calibri" w:hAnsi="Calibri"/>
+          <w:b/>
+          <w:bCs/>
+          <w:i w:val="false"/>
+          <w:iCs w:val="false"/>
+          <w:color w:val="1F3864"/>
+          <w:sz w:val="21"/>
+          <w:szCs w:val="21"/>
+        </w:rPr>
+        <w:t xml:space="preserve">• </w:t>
+      </w:r>
+      <w:r>
+        <w:rPr>
+          <w:rFonts w:ascii="Calibri" w:cs="Calibri" w:eastAsia="Calibri" w:hAnsi="Calibri"/>
+          <w:b/>
+          <w:bCs/>
+          <w:i w:val="false"/>
+          <w:iCs w:val="false"/>
+          <w:sz w:val="21"/>
+          <w:szCs w:val="21"/>
+        </w:rPr>
+        <w:t xml:space="preserve">Operating environment.</w:t>
+      </w:r>
+      <w:r>
+        <w:rPr>
+          <w:rFonts w:ascii="Calibri" w:cs="Calibri" w:eastAsia="Calibri" w:hAnsi="Calibri"/>
+          <w:b w:val="false"/>
+          <w:bCs w:val="false"/>
+          <w:i w:val="false"/>
+          <w:iCs w:val="false"/>
+          <w:sz w:val="21"/>
+          <w:szCs w:val="21"/>
+        </w:rPr>
+        <w:t xml:space="preserve"> For moisture or corrosive air use </w:t>
+      </w:r>
+      <w:r>
+        <w:rPr>
+          <w:rFonts w:ascii="Calibri" w:cs="Calibri" w:eastAsia="Calibri" w:hAnsi="Calibri"/>
+          <w:b/>
+          <w:bCs/>
+          <w:i w:val="false"/>
+          <w:iCs w:val="false"/>
+          <w:sz w:val="21"/>
+          <w:szCs w:val="21"/>
+        </w:rPr>
+        <w:t xml:space="preserve">galvanised</w:t>
+      </w:r>
+      <w:r>
+        <w:rPr>
+          <w:rFonts w:ascii="Calibri" w:cs="Calibri" w:eastAsia="Calibri" w:hAnsi="Calibri"/>
+          <w:b w:val="false"/>
+          <w:bCs w:val="false"/>
+          <w:i w:val="false"/>
+          <w:iCs w:val="false"/>
+          <w:sz w:val="21"/>
+          <w:szCs w:val="21"/>
+        </w:rPr>
+        <w:t xml:space="preserve"> rope; for hot or crushing conditions use </w:t>
+      </w:r>
+      <w:r>
+        <w:rPr>
+          <w:rFonts w:ascii="Calibri" w:cs="Calibri" w:eastAsia="Calibri" w:hAnsi="Calibri"/>
+          <w:b/>
+          <w:bCs/>
+          <w:i w:val="false"/>
+          <w:iCs w:val="false"/>
+          <w:sz w:val="21"/>
+          <w:szCs w:val="21"/>
+        </w:rPr>
+        <w:t xml:space="preserve">IWRC</w:t>
+      </w:r>
+      <w:r>
+        <w:rPr>
+          <w:rFonts w:ascii="Calibri" w:cs="Calibri" w:eastAsia="Calibri" w:hAnsi="Calibri"/>
+          <w:b w:val="false"/>
+          <w:bCs w:val="false"/>
+          <w:i w:val="false"/>
+          <w:iCs w:val="false"/>
+          <w:sz w:val="21"/>
+          <w:szCs w:val="21"/>
+        </w:rPr>
+        <w:t xml:space="preserve">; for abrasive dust use larger-diameter outer wires (6 × 7 or 6 × 19 Seale).</w:t>
+      </w:r>
+    </w:p>
+    <w:p>
+      <w:pPr>
+        <w:spacing w:after="60" w:before="60" w:line="320" w:lineRule="auto"/>
+        <w:ind w:left="480" w:hanging="200"/>
+      </w:pPr>
+      <w:r>
+        <w:rPr>
+          <w:rFonts w:ascii="Calibri" w:cs="Calibri" w:eastAsia="Calibri" w:hAnsi="Calibri"/>
+          <w:b/>
+          <w:bCs/>
+          <w:i w:val="false"/>
+          <w:iCs w:val="false"/>
+          <w:color w:val="1F3864"/>
+          <w:sz w:val="21"/>
+          <w:szCs w:val="21"/>
+        </w:rPr>
+        <w:t xml:space="preserve">• </w:t>
+      </w:r>
+      <w:r>
+        <w:rPr>
+          <w:rFonts w:ascii="Calibri" w:cs="Calibri" w:eastAsia="Calibri" w:hAnsi="Calibri"/>
+          <w:b/>
+          <w:bCs/>
+          <w:i w:val="false"/>
+          <w:iCs w:val="false"/>
+          <w:sz w:val="21"/>
+          <w:szCs w:val="21"/>
+        </w:rPr>
+        <w:t xml:space="preserve">Flexibility needed.</w:t>
+      </w:r>
+      <w:r>
+        <w:rPr>
+          <w:rFonts w:ascii="Calibri" w:cs="Calibri" w:eastAsia="Calibri" w:hAnsi="Calibri"/>
+          <w:b w:val="false"/>
+          <w:bCs w:val="false"/>
+          <w:i w:val="false"/>
+          <w:iCs w:val="false"/>
+          <w:sz w:val="21"/>
+          <w:szCs w:val="21"/>
+        </w:rPr>
+        <w:t xml:space="preserve"> More wires per strand (6 × 37 or 8 × 19) → more flexible, suited to small sheaves and frequent bending; fewer wires (6 × 7) → stiffer, more wear-resistant.</w:t>
+      </w:r>
+    </w:p>
+    <w:p>
+      <w:pPr>
+        <w:spacing w:after="60" w:before="60" w:line="320" w:lineRule="auto"/>
+        <w:ind w:left="480" w:hanging="200"/>
+      </w:pPr>
+      <w:r>
+        <w:rPr>
+          <w:rFonts w:ascii="Calibri" w:cs="Calibri" w:eastAsia="Calibri" w:hAnsi="Calibri"/>
+          <w:b/>
+          <w:bCs/>
+          <w:i w:val="false"/>
+          <w:iCs w:val="false"/>
+          <w:color w:val="1F3864"/>
+          <w:sz w:val="21"/>
+          <w:szCs w:val="21"/>
+        </w:rPr>
+        <w:t xml:space="preserve">• </w:t>
+      </w:r>
+      <w:r>
+        <w:rPr>
+          <w:rFonts w:ascii="Calibri" w:cs="Calibri" w:eastAsia="Calibri" w:hAnsi="Calibri"/>
+          <w:b/>
+          <w:bCs/>
+          <w:i w:val="false"/>
+          <w:iCs w:val="false"/>
+          <w:sz w:val="21"/>
+          <w:szCs w:val="21"/>
+        </w:rPr>
+        <w:t xml:space="preserve">Lay direction and type.</w:t>
+      </w:r>
+      <w:r>
+        <w:rPr>
+          <w:rFonts w:ascii="Calibri" w:cs="Calibri" w:eastAsia="Calibri" w:hAnsi="Calibri"/>
+          <w:b w:val="false"/>
+          <w:bCs w:val="false"/>
+          <w:i w:val="false"/>
+          <w:iCs w:val="false"/>
+          <w:sz w:val="21"/>
+          <w:szCs w:val="21"/>
+        </w:rPr>
+        <w:t xml:space="preserve"> Ordinary (regular) lay resists kinking and is the usual choice; Lang’s lay has lower bending stress and longer life but can rotate under free load, so it is used only where both ends are fixed.</w:t>
+      </w:r>
+    </w:p>
+    <w:p>
+      <w:pPr>
+        <w:spacing w:after="60" w:before="60" w:line="320" w:lineRule="auto"/>
+        <w:ind w:left="480" w:hanging="200"/>
+      </w:pPr>
+      <w:r>
+        <w:rPr>
+          <w:rFonts w:ascii="Calibri" w:cs="Calibri" w:eastAsia="Calibri" w:hAnsi="Calibri"/>
+          <w:b/>
+          <w:bCs/>
+          <w:i w:val="false"/>
+          <w:iCs w:val="false"/>
+          <w:color w:val="1F3864"/>
+          <w:sz w:val="21"/>
+          <w:szCs w:val="21"/>
+        </w:rPr>
+        <w:t xml:space="preserve">• </w:t>
+      </w:r>
+      <w:r>
+        <w:rPr>
+          <w:rFonts w:ascii="Calibri" w:cs="Calibri" w:eastAsia="Calibri" w:hAnsi="Calibri"/>
+          <w:b/>
+          <w:bCs/>
+          <w:i w:val="false"/>
+          <w:iCs w:val="false"/>
+          <w:sz w:val="21"/>
+          <w:szCs w:val="21"/>
+        </w:rPr>
+        <w:t xml:space="preserve">Code of practice.</w:t>
+      </w:r>
+      <w:r>
+        <w:rPr>
+          <w:rFonts w:ascii="Calibri" w:cs="Calibri" w:eastAsia="Calibri" w:hAnsi="Calibri"/>
+          <w:b w:val="false"/>
+          <w:bCs w:val="false"/>
+          <w:i w:val="false"/>
+          <w:iCs w:val="false"/>
+          <w:sz w:val="21"/>
+          <w:szCs w:val="21"/>
+        </w:rPr>
+        <w:t xml:space="preserve"> Follow </w:t>
+      </w:r>
+      <w:r>
+        <w:rPr>
+          <w:rFonts w:ascii="Calibri" w:cs="Calibri" w:eastAsia="Calibri" w:hAnsi="Calibri"/>
+          <w:b/>
+          <w:bCs/>
+          <w:i w:val="false"/>
+          <w:iCs w:val="false"/>
+          <w:sz w:val="21"/>
+          <w:szCs w:val="21"/>
+        </w:rPr>
+        <w:t xml:space="preserve">IS 2266 / IS 2365</w:t>
+      </w:r>
+      <w:r>
+        <w:rPr>
+          <w:rFonts w:ascii="Calibri" w:cs="Calibri" w:eastAsia="Calibri" w:hAnsi="Calibri"/>
+          <w:b w:val="false"/>
+          <w:bCs w:val="false"/>
+          <w:i w:val="false"/>
+          <w:iCs w:val="false"/>
+          <w:sz w:val="21"/>
+          <w:szCs w:val="21"/>
+        </w:rPr>
+        <w:t xml:space="preserve"> for the rope itself and the relevant equipment code (IS 807 for cranes, IS 2938 for lifts).</w:t>
+      </w:r>
+    </w:p>
+    <w:p>
+      <w:pPr>
+        <w:spacing w:after="60" w:before="60" w:line="320" w:lineRule="auto"/>
+        <w:ind w:left="480" w:hanging="200"/>
+      </w:pPr>
+      <w:r>
+        <w:rPr>
+          <w:rFonts w:ascii="Calibri" w:cs="Calibri" w:eastAsia="Calibri" w:hAnsi="Calibri"/>
+          <w:b/>
+          <w:bCs/>
+          <w:i w:val="false"/>
+          <w:iCs w:val="false"/>
+          <w:color w:val="1F3864"/>
+          <w:sz w:val="21"/>
+          <w:szCs w:val="21"/>
+        </w:rPr>
+        <w:t xml:space="preserve">• </w:t>
+      </w:r>
+      <w:r>
+        <w:rPr>
+          <w:rFonts w:ascii="Calibri" w:cs="Calibri" w:eastAsia="Calibri" w:hAnsi="Calibri"/>
+          <w:b/>
+          <w:bCs/>
+          <w:i w:val="false"/>
+          <w:iCs w:val="false"/>
+          <w:sz w:val="21"/>
+          <w:szCs w:val="21"/>
+        </w:rPr>
+        <w:t xml:space="preserve">Length and reeving.</w:t>
+      </w:r>
+      <w:r>
+        <w:rPr>
+          <w:rFonts w:ascii="Calibri" w:cs="Calibri" w:eastAsia="Calibri" w:hAnsi="Calibri"/>
+          <w:b w:val="false"/>
+          <w:bCs w:val="false"/>
+          <w:i w:val="false"/>
+          <w:iCs w:val="false"/>
+          <w:sz w:val="21"/>
+          <w:szCs w:val="21"/>
+        </w:rPr>
+        <w:t xml:space="preserve"> Allow for the full lift height, the dead turns on the drum (minimum two) and the reeving factor (how many parts hang from the hook).</w:t>
       </w:r>
     </w:p>
     <w:p>
       <w:pPr>
         <w:keepNext/>
-        <w:spacing w:after="40" w:before="160" w:line="276" w:lineRule="auto"/>
+        <w:spacing w:after="60" w:before="260" w:line="276" w:lineRule="auto"/>
       </w:pPr>
       <w:r>
         <w:rPr>
@@ -791,7 +2803,7 @@
                 <w:sz w:val="17"/>
                 <w:szCs w:val="17"/>
               </w:rPr>
-              <w:t xml:space="preserve">Stores/winds</w:t>
+              <w:t xml:space="preserve">Stores and winds</w:t>
             </w:r>
             <w:r>
               <w:rPr>
@@ -803,7 +2815,7 @@
                 <w:sz w:val="17"/>
                 <w:szCs w:val="17"/>
               </w:rPr>
-              <w:t xml:space="preserve"> the rope</w:t>
+              <w:t xml:space="preserve"> the rope on and off the hoist</w:t>
             </w:r>
           </w:p>
         </w:tc>
@@ -833,7 +2845,7 @@
                 <w:sz w:val="17"/>
                 <w:szCs w:val="17"/>
               </w:rPr>
-              <w:t xml:space="preserve">Guides/redirects</w:t>
+              <w:t xml:space="preserve">Guides and redirects</w:t>
             </w:r>
             <w:r>
               <w:rPr>
@@ -910,7 +2922,7 @@
                 <w:sz w:val="17"/>
                 <w:szCs w:val="17"/>
               </w:rPr>
-              <w:t xml:space="preserve">Rotates with the hoist; winds rope in layers</w:t>
+              <w:t xml:space="preserve">Rotates with the hoist/winch; winds the rope in layers</w:t>
             </w:r>
           </w:p>
         </w:tc>
@@ -940,7 +2952,7 @@
                 <w:sz w:val="17"/>
                 <w:szCs w:val="17"/>
               </w:rPr>
-              <w:t xml:space="preserve">Idles (or driven) on a pin</w:t>
+              <w:t xml:space="preserve">Idles freely (or is driven) on a pin</w:t>
             </w:r>
           </w:p>
         </w:tc>
@@ -1005,7 +3017,7 @@
                 <w:sz w:val="17"/>
                 <w:szCs w:val="17"/>
               </w:rPr>
-              <w:t xml:space="preserve">Helical groove the full length</w:t>
+              <w:t xml:space="preserve">Helical groove covering the full length</w:t>
             </w:r>
           </w:p>
         </w:tc>
@@ -1035,7 +3047,7 @@
                 <w:sz w:val="17"/>
                 <w:szCs w:val="17"/>
               </w:rPr>
-              <w:t xml:space="preserve">Single groove on the rim</w:t>
+              <w:t xml:space="preserve">One or two grooves on the rim</w:t>
             </w:r>
           </w:p>
         </w:tc>
@@ -1100,7 +3112,7 @@
                 <w:sz w:val="17"/>
                 <w:szCs w:val="17"/>
               </w:rPr>
-              <w:t xml:space="preserve">Often smaller</w:t>
+              <w:t xml:space="preserve">Often smaller than the sheaves</w:t>
             </w:r>
           </w:p>
         </w:tc>
@@ -1130,7 +3142,197 @@
                 <w:sz w:val="17"/>
                 <w:szCs w:val="17"/>
               </w:rPr>
-              <w:t xml:space="preserve">Usually 20–40 × rope dia.</w:t>
+              <w:t xml:space="preserve">Usually 20 – 40 × rope diameter</w:t>
+            </w:r>
+          </w:p>
+        </w:tc>
+      </w:tr>
+      <w:tr>
+        <w:trPr>
+          <w:cantSplit/>
+        </w:trPr>
+        <w:tc>
+          <w:tcPr>
+            <w:tcW w:type="dxa" w:w="1948"/>
+            <w:shd w:fill="FFFFFF" w:color="auto" w:val="clear"/>
+            <w:tcMar>
+              <w:top w:type="dxa" w:w="60"/>
+              <w:left w:type="dxa" w:w="110"/>
+              <w:bottom w:type="dxa" w:w="60"/>
+              <w:right w:type="dxa" w:w="110"/>
+            </w:tcMar>
+            <w:vAlign w:val="center"/>
+          </w:tcPr>
+          <w:p>
+            <w:pPr>
+              <w:spacing w:after="26" w:before="26" w:line="252" w:lineRule="auto"/>
+            </w:pPr>
+            <w:r>
+              <w:rPr>
+                <w:rFonts w:ascii="Calibri" w:cs="Calibri" w:eastAsia="Calibri" w:hAnsi="Calibri"/>
+                <w:b w:val="false"/>
+                <w:bCs w:val="false"/>
+                <w:i w:val="false"/>
+                <w:iCs w:val="false"/>
+                <w:sz w:val="17"/>
+                <w:szCs w:val="17"/>
+              </w:rPr>
+              <w:t xml:space="preserve">Material</w:t>
+            </w:r>
+          </w:p>
+        </w:tc>
+        <w:tc>
+          <w:tcPr>
+            <w:tcW w:type="dxa" w:w="3896"/>
+            <w:shd w:fill="FFFFFF" w:color="auto" w:val="clear"/>
+            <w:tcMar>
+              <w:top w:type="dxa" w:w="60"/>
+              <w:left w:type="dxa" w:w="110"/>
+              <w:bottom w:type="dxa" w:w="60"/>
+              <w:right w:type="dxa" w:w="110"/>
+            </w:tcMar>
+            <w:vAlign w:val="center"/>
+          </w:tcPr>
+          <w:p>
+            <w:pPr>
+              <w:spacing w:after="26" w:before="26" w:line="252" w:lineRule="auto"/>
+            </w:pPr>
+            <w:r>
+              <w:rPr>
+                <w:rFonts w:ascii="Calibri" w:cs="Calibri" w:eastAsia="Calibri" w:hAnsi="Calibri"/>
+                <w:b w:val="false"/>
+                <w:bCs w:val="false"/>
+                <w:i w:val="false"/>
+                <w:iCs w:val="false"/>
+                <w:sz w:val="17"/>
+                <w:szCs w:val="17"/>
+              </w:rPr>
+              <w:t xml:space="preserve">Cast iron or welded steel shell with grooves</w:t>
+            </w:r>
+          </w:p>
+        </w:tc>
+        <w:tc>
+          <w:tcPr>
+            <w:tcW w:type="dxa" w:w="3896"/>
+            <w:shd w:fill="FFFFFF" w:color="auto" w:val="clear"/>
+            <w:tcMar>
+              <w:top w:type="dxa" w:w="60"/>
+              <w:left w:type="dxa" w:w="110"/>
+              <w:bottom w:type="dxa" w:w="60"/>
+              <w:right w:type="dxa" w:w="110"/>
+            </w:tcMar>
+            <w:vAlign w:val="center"/>
+          </w:tcPr>
+          <w:p>
+            <w:pPr>
+              <w:spacing w:after="26" w:before="26" w:line="252" w:lineRule="auto"/>
+            </w:pPr>
+            <w:r>
+              <w:rPr>
+                <w:rFonts w:ascii="Calibri" w:cs="Calibri" w:eastAsia="Calibri" w:hAnsi="Calibri"/>
+                <w:b w:val="false"/>
+                <w:bCs w:val="false"/>
+                <w:i w:val="false"/>
+                <w:iCs w:val="false"/>
+                <w:sz w:val="17"/>
+                <w:szCs w:val="17"/>
+              </w:rPr>
+              <w:t xml:space="preserve">Cast iron or steel, machined groove</w:t>
+            </w:r>
+          </w:p>
+        </w:tc>
+      </w:tr>
+      <w:tr>
+        <w:trPr>
+          <w:cantSplit/>
+        </w:trPr>
+        <w:tc>
+          <w:tcPr>
+            <w:tcW w:type="dxa" w:w="1948"/>
+            <w:shd w:fill="F6F8FC" w:color="auto" w:val="clear"/>
+            <w:tcMar>
+              <w:top w:type="dxa" w:w="60"/>
+              <w:left w:type="dxa" w:w="110"/>
+              <w:bottom w:type="dxa" w:w="60"/>
+              <w:right w:type="dxa" w:w="110"/>
+            </w:tcMar>
+            <w:vAlign w:val="center"/>
+          </w:tcPr>
+          <w:p>
+            <w:pPr>
+              <w:spacing w:after="26" w:before="26" w:line="252" w:lineRule="auto"/>
+            </w:pPr>
+            <w:r>
+              <w:rPr>
+                <w:rFonts w:ascii="Calibri" w:cs="Calibri" w:eastAsia="Calibri" w:hAnsi="Calibri"/>
+                <w:b w:val="false"/>
+                <w:bCs w:val="false"/>
+                <w:i w:val="false"/>
+                <w:iCs w:val="false"/>
+                <w:sz w:val="17"/>
+                <w:szCs w:val="17"/>
+              </w:rPr>
+              <w:t xml:space="preserve">Where used</w:t>
+            </w:r>
+          </w:p>
+        </w:tc>
+        <w:tc>
+          <w:tcPr>
+            <w:tcW w:type="dxa" w:w="3896"/>
+            <w:shd w:fill="F6F8FC" w:color="auto" w:val="clear"/>
+            <w:tcMar>
+              <w:top w:type="dxa" w:w="60"/>
+              <w:left w:type="dxa" w:w="110"/>
+              <w:bottom w:type="dxa" w:w="60"/>
+              <w:right w:type="dxa" w:w="110"/>
+            </w:tcMar>
+            <w:vAlign w:val="center"/>
+          </w:tcPr>
+          <w:p>
+            <w:pPr>
+              <w:spacing w:after="26" w:before="26" w:line="252" w:lineRule="auto"/>
+            </w:pPr>
+            <w:r>
+              <w:rPr>
+                <w:rFonts w:ascii="Calibri" w:cs="Calibri" w:eastAsia="Calibri" w:hAnsi="Calibri"/>
+                <w:b w:val="false"/>
+                <w:bCs w:val="false"/>
+                <w:i w:val="false"/>
+                <w:iCs w:val="false"/>
+                <w:sz w:val="17"/>
+                <w:szCs w:val="17"/>
+              </w:rPr>
+              <w:t xml:space="preserve">On the hoist/winch itself</w:t>
+            </w:r>
+          </w:p>
+        </w:tc>
+        <w:tc>
+          <w:tcPr>
+            <w:tcW w:type="dxa" w:w="3896"/>
+            <w:shd w:fill="F6F8FC" w:color="auto" w:val="clear"/>
+            <w:tcMar>
+              <w:top w:type="dxa" w:w="60"/>
+              <w:left w:type="dxa" w:w="110"/>
+              <w:bottom w:type="dxa" w:w="60"/>
+              <w:right w:type="dxa" w:w="110"/>
+            </w:tcMar>
+            <w:vAlign w:val="center"/>
+          </w:tcPr>
+          <w:p>
+            <w:pPr>
+              <w:spacing w:after="26" w:before="26" w:line="252" w:lineRule="auto"/>
+            </w:pPr>
+            <w:r>
+              <w:rPr>
+                <w:rFonts w:ascii="Calibri" w:cs="Calibri" w:eastAsia="Calibri" w:hAnsi="Calibri"/>
+                <w:b w:val="false"/>
+                <w:bCs w:val="false"/>
+                <w:i w:val="false"/>
+                <w:iCs w:val="false"/>
+                <w:sz w:val="17"/>
+                <w:szCs w:val="17"/>
+              </w:rPr>
+              <w:t xml:space="preserve">In pulley blocks, snatch blocks and guides</w:t>
             </w:r>
           </w:p>
         </w:tc>
@@ -1144,7 +3346,7 @@
     <w:p>
       <w:pPr>
         <w:keepNext/>
-        <w:spacing w:after="40" w:before="160" w:line="276" w:lineRule="auto"/>
+        <w:spacing w:after="60" w:before="260" w:line="276" w:lineRule="auto"/>
       </w:pPr>
       <w:r>
         <w:rPr>
@@ -1169,25 +3371,55 @@
           <w:sz w:val="21"/>
           <w:szCs w:val="21"/>
         </w:rPr>
-        <w:t xml:space="preserve">Numerical — Size of 6 × 19 wire rope for a mine hoist (W = 50 kN, FOS = 5, ultimate strength 1770 N/mm²).</w:t>
-      </w:r>
-    </w:p>
-    <w:p>
-      <w:pPr>
-        <w:spacing w:after="60" w:before="0" w:line="276" w:lineRule="auto"/>
+        <w:t xml:space="preserve">Numerical — Size of a 6 × 19 wire rope for a mine hoist (W = 50 kN, FOS = 5, ultimate strength σu = 1770 N/mm²).</w:t>
+      </w:r>
+    </w:p>
+    <w:p>
+      <w:pPr>
+        <w:spacing w:after="150" w:before="0" w:line="340" w:lineRule="auto"/>
         <w:ind w:left="140"/>
       </w:pPr>
       <w:r>
         <w:rPr>
           <w:rFonts w:ascii="Calibri" w:cs="Calibri" w:eastAsia="Calibri" w:hAnsi="Calibri"/>
-          <w:b w:val="false"/>
-          <w:bCs w:val="false"/>
-          <w:i w:val="false"/>
-          <w:iCs w:val="false"/>
-          <w:sz w:val="21"/>
-          <w:szCs w:val="21"/>
-        </w:rPr>
-        <w:t xml:space="preserve">Design load F = W × FOS = 50 × 5 = </w:t>
+          <w:b/>
+          <w:bCs/>
+          <w:i w:val="false"/>
+          <w:iCs w:val="false"/>
+          <w:sz w:val="21"/>
+          <w:szCs w:val="21"/>
+        </w:rPr>
+        <w:t xml:space="preserve">Step 1 — Design (breaking) load.</w:t>
+      </w:r>
+      <w:r>
+        <w:rPr>
+          <w:rFonts w:ascii="Calibri" w:cs="Calibri" w:eastAsia="Calibri" w:hAnsi="Calibri"/>
+          <w:b w:val="false"/>
+          <w:bCs w:val="false"/>
+          <w:i w:val="false"/>
+          <w:iCs w:val="false"/>
+          <w:sz w:val="21"/>
+          <w:szCs w:val="21"/>
+        </w:rPr>
+        <w:t xml:space="preserve">  Rope must be designed for the full breaking load so that at the working load the required FOS is available.</w:t>
+      </w:r>
+    </w:p>
+    <w:p>
+      <w:pPr>
+        <w:spacing w:after="150" w:before="0" w:line="340" w:lineRule="auto"/>
+        <w:ind w:left="140"/>
+      </w:pPr>
+      <w:r>
+        <w:rPr>
+          <w:rFonts w:ascii="Calibri" w:cs="Calibri" w:eastAsia="Calibri" w:hAnsi="Calibri"/>
+          <w:b w:val="false"/>
+          <w:bCs w:val="false"/>
+          <w:i w:val="false"/>
+          <w:iCs w:val="false"/>
+          <w:sz w:val="21"/>
+          <w:szCs w:val="21"/>
+        </w:rPr>
+        <w:t xml:space="preserve">F = W × FOS = 50 × 5 = </w:t>
       </w:r>
       <w:r>
         <w:rPr>
@@ -1211,31 +3443,211 @@
           <w:sz w:val="21"/>
           <w:szCs w:val="21"/>
         </w:rPr>
-        <w:t xml:space="preserve">. For 6 × 19 FC rope, breaking load Fb ≈ 0.38 d² × σu (d in mm). Setting Fb = F → d² = 250000 / (0.38 × 1770) → d ≈ </w:t>
-      </w:r>
-      <w:r>
-        <w:rPr>
-          <w:rFonts w:ascii="Calibri" w:cs="Calibri" w:eastAsia="Calibri" w:hAnsi="Calibri"/>
-          <w:b/>
-          <w:bCs/>
-          <w:i w:val="false"/>
-          <w:iCs w:val="false"/>
-          <w:sz w:val="21"/>
-          <w:szCs w:val="21"/>
-        </w:rPr>
-        <w:t xml:space="preserve">24.1 mm → select 26 mm</w:t>
-      </w:r>
-      <w:r>
-        <w:rPr>
-          <w:rFonts w:ascii="Calibri" w:cs="Calibri" w:eastAsia="Calibri" w:hAnsi="Calibri"/>
-          <w:b w:val="false"/>
-          <w:bCs w:val="false"/>
-          <w:i w:val="false"/>
-          <w:iCs w:val="false"/>
-          <w:sz w:val="21"/>
-          <w:szCs w:val="21"/>
-        </w:rPr>
-        <w:t xml:space="preserve">. Then dw ≈ 0.063 d ≈ 1.64 mm; sheave diameter D = 40 d = </w:t>
+        <w:t xml:space="preserve"> = 250 000 N.</w:t>
+      </w:r>
+    </w:p>
+    <w:p>
+      <w:pPr>
+        <w:spacing w:after="150" w:before="0" w:line="340" w:lineRule="auto"/>
+        <w:ind w:left="140"/>
+      </w:pPr>
+      <w:r>
+        <w:rPr>
+          <w:rFonts w:ascii="Calibri" w:cs="Calibri" w:eastAsia="Calibri" w:hAnsi="Calibri"/>
+          <w:b/>
+          <w:bCs/>
+          <w:i w:val="false"/>
+          <w:iCs w:val="false"/>
+          <w:sz w:val="21"/>
+          <w:szCs w:val="21"/>
+        </w:rPr>
+        <w:t xml:space="preserve">Step 2 — Breaking-load formula.</w:t>
+      </w:r>
+      <w:r>
+        <w:rPr>
+          <w:rFonts w:ascii="Calibri" w:cs="Calibri" w:eastAsia="Calibri" w:hAnsi="Calibri"/>
+          <w:b w:val="false"/>
+          <w:bCs w:val="false"/>
+          <w:i w:val="false"/>
+          <w:iCs w:val="false"/>
+          <w:sz w:val="21"/>
+          <w:szCs w:val="21"/>
+        </w:rPr>
+        <w:t xml:space="preserve">  For a 6 × 19 FC rope the approximate breaking load is</w:t>
+      </w:r>
+    </w:p>
+    <w:p>
+      <w:pPr>
+        <w:spacing w:after="150" w:before="0" w:line="340" w:lineRule="auto"/>
+        <w:ind w:left="140"/>
+      </w:pPr>
+      <w:r>
+        <w:rPr>
+          <w:rFonts w:ascii="Calibri" w:cs="Calibri" w:eastAsia="Calibri" w:hAnsi="Calibri"/>
+          <w:b w:val="false"/>
+          <w:bCs w:val="false"/>
+          <w:i w:val="false"/>
+          <w:iCs w:val="false"/>
+          <w:sz w:val="21"/>
+          <w:szCs w:val="21"/>
+        </w:rPr>
+        <w:t xml:space="preserve">Fb ≈ 0.38 d² · σu   (d in mm, σu in N/mm²).</w:t>
+      </w:r>
+    </w:p>
+    <w:p>
+      <w:pPr>
+        <w:spacing w:after="150" w:before="0" w:line="340" w:lineRule="auto"/>
+        <w:ind w:left="140"/>
+      </w:pPr>
+      <w:r>
+        <w:rPr>
+          <w:rFonts w:ascii="Calibri" w:cs="Calibri" w:eastAsia="Calibri" w:hAnsi="Calibri"/>
+          <w:b/>
+          <w:bCs/>
+          <w:i w:val="false"/>
+          <w:iCs w:val="false"/>
+          <w:sz w:val="21"/>
+          <w:szCs w:val="21"/>
+        </w:rPr>
+        <w:t xml:space="preserve">Step 3 — Rope diameter.</w:t>
+      </w:r>
+      <w:r>
+        <w:rPr>
+          <w:rFonts w:ascii="Calibri" w:cs="Calibri" w:eastAsia="Calibri" w:hAnsi="Calibri"/>
+          <w:b w:val="false"/>
+          <w:bCs w:val="false"/>
+          <w:i w:val="false"/>
+          <w:iCs w:val="false"/>
+          <w:sz w:val="21"/>
+          <w:szCs w:val="21"/>
+        </w:rPr>
+        <w:t xml:space="preserve">  Setting Fb = F:</w:t>
+      </w:r>
+    </w:p>
+    <w:p>
+      <w:pPr>
+        <w:spacing w:after="150" w:before="0" w:line="340" w:lineRule="auto"/>
+        <w:ind w:left="140"/>
+      </w:pPr>
+      <w:r>
+        <w:rPr>
+          <w:rFonts w:ascii="Calibri" w:cs="Calibri" w:eastAsia="Calibri" w:hAnsi="Calibri"/>
+          <w:b w:val="false"/>
+          <w:bCs w:val="false"/>
+          <w:i w:val="false"/>
+          <w:iCs w:val="false"/>
+          <w:sz w:val="21"/>
+          <w:szCs w:val="21"/>
+        </w:rPr>
+        <w:t xml:space="preserve">d² = 250 000 / (0.38 × 1770) ≈ 371.5  →  d ≈ </w:t>
+      </w:r>
+      <w:r>
+        <w:rPr>
+          <w:rFonts w:ascii="Calibri" w:cs="Calibri" w:eastAsia="Calibri" w:hAnsi="Calibri"/>
+          <w:b/>
+          <w:bCs/>
+          <w:i w:val="false"/>
+          <w:iCs w:val="false"/>
+          <w:sz w:val="21"/>
+          <w:szCs w:val="21"/>
+        </w:rPr>
+        <w:t xml:space="preserve">24.1 mm → select next standard 26 mm</w:t>
+      </w:r>
+      <w:r>
+        <w:rPr>
+          <w:rFonts w:ascii="Calibri" w:cs="Calibri" w:eastAsia="Calibri" w:hAnsi="Calibri"/>
+          <w:b w:val="false"/>
+          <w:bCs w:val="false"/>
+          <w:i w:val="false"/>
+          <w:iCs w:val="false"/>
+          <w:sz w:val="21"/>
+          <w:szCs w:val="21"/>
+        </w:rPr>
+        <w:t xml:space="preserve">.</w:t>
+      </w:r>
+    </w:p>
+    <w:p>
+      <w:pPr>
+        <w:spacing w:after="150" w:before="0" w:line="340" w:lineRule="auto"/>
+        <w:ind w:left="140"/>
+      </w:pPr>
+      <w:r>
+        <w:rPr>
+          <w:rFonts w:ascii="Calibri" w:cs="Calibri" w:eastAsia="Calibri" w:hAnsi="Calibri"/>
+          <w:b/>
+          <w:bCs/>
+          <w:i w:val="false"/>
+          <w:iCs w:val="false"/>
+          <w:sz w:val="21"/>
+          <w:szCs w:val="21"/>
+        </w:rPr>
+        <w:t xml:space="preserve">Step 4 — Wire diameter.</w:t>
+      </w:r>
+      <w:r>
+        <w:rPr>
+          <w:rFonts w:ascii="Calibri" w:cs="Calibri" w:eastAsia="Calibri" w:hAnsi="Calibri"/>
+          <w:b w:val="false"/>
+          <w:bCs w:val="false"/>
+          <w:i w:val="false"/>
+          <w:iCs w:val="false"/>
+          <w:sz w:val="21"/>
+          <w:szCs w:val="21"/>
+        </w:rPr>
+        <w:t xml:space="preserve">  dw ≈ 0.063 × d = 0.063 × 26 ≈ </w:t>
+      </w:r>
+      <w:r>
+        <w:rPr>
+          <w:rFonts w:ascii="Calibri" w:cs="Calibri" w:eastAsia="Calibri" w:hAnsi="Calibri"/>
+          <w:b/>
+          <w:bCs/>
+          <w:i w:val="false"/>
+          <w:iCs w:val="false"/>
+          <w:sz w:val="21"/>
+          <w:szCs w:val="21"/>
+        </w:rPr>
+        <w:t xml:space="preserve">1.64 mm</w:t>
+      </w:r>
+      <w:r>
+        <w:rPr>
+          <w:rFonts w:ascii="Calibri" w:cs="Calibri" w:eastAsia="Calibri" w:hAnsi="Calibri"/>
+          <w:b w:val="false"/>
+          <w:bCs w:val="false"/>
+          <w:i w:val="false"/>
+          <w:iCs w:val="false"/>
+          <w:sz w:val="21"/>
+          <w:szCs w:val="21"/>
+        </w:rPr>
+        <w:t xml:space="preserve">.</w:t>
+      </w:r>
+    </w:p>
+    <w:p>
+      <w:pPr>
+        <w:spacing w:after="150" w:before="0" w:line="340" w:lineRule="auto"/>
+        <w:ind w:left="140"/>
+      </w:pPr>
+      <w:r>
+        <w:rPr>
+          <w:rFonts w:ascii="Calibri" w:cs="Calibri" w:eastAsia="Calibri" w:hAnsi="Calibri"/>
+          <w:b/>
+          <w:bCs/>
+          <w:i w:val="false"/>
+          <w:iCs w:val="false"/>
+          <w:sz w:val="21"/>
+          <w:szCs w:val="21"/>
+        </w:rPr>
+        <w:t xml:space="preserve">Step 5 — Sheave diameter.</w:t>
+      </w:r>
+      <w:r>
+        <w:rPr>
+          <w:rFonts w:ascii="Calibri" w:cs="Calibri" w:eastAsia="Calibri" w:hAnsi="Calibri"/>
+          <w:b w:val="false"/>
+          <w:bCs w:val="false"/>
+          <w:i w:val="false"/>
+          <w:iCs w:val="false"/>
+          <w:sz w:val="21"/>
+          <w:szCs w:val="21"/>
+        </w:rPr>
+        <w:t xml:space="preserve">  To keep bending stress in the wires low, D = 40 d = 40 × 26 = </w:t>
       </w:r>
       <w:r>
         <w:rPr>
@@ -1260,6 +3672,114 @@
           <w:szCs w:val="21"/>
         </w:rPr>
         <w:t xml:space="preserve">.</w:t>
+      </w:r>
+    </w:p>
+    <w:p>
+      <w:pPr>
+        <w:spacing w:after="150" w:before="0" w:line="340" w:lineRule="auto"/>
+        <w:ind w:left="140"/>
+      </w:pPr>
+      <w:r>
+        <w:rPr>
+          <w:rFonts w:ascii="Calibri" w:cs="Calibri" w:eastAsia="Calibri" w:hAnsi="Calibri"/>
+          <w:b/>
+          <w:bCs/>
+          <w:i w:val="false"/>
+          <w:iCs w:val="false"/>
+          <w:sz w:val="21"/>
+          <w:szCs w:val="21"/>
+        </w:rPr>
+        <w:t xml:space="preserve">Step 6 — Verify the actual stress.</w:t>
+      </w:r>
+      <w:r>
+        <w:rPr>
+          <w:rFonts w:ascii="Calibri" w:cs="Calibri" w:eastAsia="Calibri" w:hAnsi="Calibri"/>
+          <w:b w:val="false"/>
+          <w:bCs w:val="false"/>
+          <w:i w:val="false"/>
+          <w:iCs w:val="false"/>
+          <w:sz w:val="21"/>
+          <w:szCs w:val="21"/>
+        </w:rPr>
+        <w:t xml:space="preserve">  With d = 26 mm, actual breaking load Fb = 0.38 × 26² × 1770 ≈ 454 kN; actual FOS = 454 / 50 ≈ </w:t>
+      </w:r>
+      <w:r>
+        <w:rPr>
+          <w:rFonts w:ascii="Calibri" w:cs="Calibri" w:eastAsia="Calibri" w:hAnsi="Calibri"/>
+          <w:b/>
+          <w:bCs/>
+          <w:i w:val="false"/>
+          <w:iCs w:val="false"/>
+          <w:sz w:val="21"/>
+          <w:szCs w:val="21"/>
+        </w:rPr>
+        <w:t xml:space="preserve">9.1 (&gt;&gt; 5, safe)</w:t>
+      </w:r>
+      <w:r>
+        <w:rPr>
+          <w:rFonts w:ascii="Calibri" w:cs="Calibri" w:eastAsia="Calibri" w:hAnsi="Calibri"/>
+          <w:b w:val="false"/>
+          <w:bCs w:val="false"/>
+          <w:i w:val="false"/>
+          <w:iCs w:val="false"/>
+          <w:sz w:val="21"/>
+          <w:szCs w:val="21"/>
+        </w:rPr>
+        <w:t xml:space="preserve">. The extra margin covers shock loads and corrosion.</w:t>
+      </w:r>
+    </w:p>
+    <w:p>
+      <w:pPr>
+        <w:spacing w:after="150" w:before="0" w:line="340" w:lineRule="auto"/>
+        <w:ind w:left="140"/>
+      </w:pPr>
+      <w:r>
+        <w:rPr>
+          <w:rFonts w:ascii="Calibri" w:cs="Calibri" w:eastAsia="Calibri" w:hAnsi="Calibri"/>
+          <w:b/>
+          <w:bCs/>
+          <w:i w:val="false"/>
+          <w:iCs w:val="false"/>
+          <w:sz w:val="21"/>
+          <w:szCs w:val="21"/>
+        </w:rPr>
+        <w:t xml:space="preserve">Step 7 — Bending stress in a wire</w:t>
+      </w:r>
+      <w:r>
+        <w:rPr>
+          <w:rFonts w:ascii="Calibri" w:cs="Calibri" w:eastAsia="Calibri" w:hAnsi="Calibri"/>
+          <w:b w:val="false"/>
+          <w:bCs w:val="false"/>
+          <w:i w:val="false"/>
+          <w:iCs w:val="false"/>
+          <w:sz w:val="21"/>
+          <w:szCs w:val="21"/>
+        </w:rPr>
+        <w:t xml:space="preserve"> (as it passes over the sheave):  σb = E × dw / D = 2 × 10⁵ × 1.64 / 1040 ≈ </w:t>
+      </w:r>
+      <w:r>
+        <w:rPr>
+          <w:rFonts w:ascii="Calibri" w:cs="Calibri" w:eastAsia="Calibri" w:hAnsi="Calibri"/>
+          <w:b/>
+          <w:bCs/>
+          <w:i w:val="false"/>
+          <w:iCs w:val="false"/>
+          <w:sz w:val="21"/>
+          <w:szCs w:val="21"/>
+        </w:rPr>
+        <w:t xml:space="preserve">315 N/mm²</w:t>
+      </w:r>
+      <w:r>
+        <w:rPr>
+          <w:rFonts w:ascii="Calibri" w:cs="Calibri" w:eastAsia="Calibri" w:hAnsi="Calibri"/>
+          <w:b w:val="false"/>
+          <w:bCs w:val="false"/>
+          <w:i w:val="false"/>
+          <w:iCs w:val="false"/>
+          <w:sz w:val="21"/>
+          <w:szCs w:val="21"/>
+        </w:rPr>
+        <w:t xml:space="preserve">, well below the fatigue strength of the wire, confirming that D = 40 d is adequate.</w:t>
       </w:r>
     </w:p>
     <w:tbl>
@@ -1282,9 +3802,9 @@
           <w:tcPr>
             <w:shd w:fill="EAF1FB" w:color="auto" w:val="clear"/>
             <w:tcMar>
-              <w:top w:type="dxa" w:w="60"/>
+              <w:top w:type="dxa" w:w="80"/>
               <w:left w:type="dxa" w:w="200"/>
-              <w:bottom w:type="dxa" w:w="60"/>
+              <w:bottom w:type="dxa" w:w="80"/>
               <w:right w:type="dxa" w:w="200"/>
             </w:tcMar>
           </w:tcPr>
@@ -1339,7 +3859,7 @@
                 <w:sz w:val="19"/>
                 <w:szCs w:val="19"/>
               </w:rPr>
-              <w:t xml:space="preserve">; wire dia </w:t>
+              <w:t xml:space="preserve">;  wire dia </w:t>
             </w:r>
             <w:r>
               <w:rPr>
@@ -1363,7 +3883,7 @@
                 <w:sz w:val="19"/>
                 <w:szCs w:val="19"/>
               </w:rPr>
-              <w:t xml:space="preserve">; sheave dia </w:t>
+              <w:t xml:space="preserve">;  sheave dia </w:t>
             </w:r>
             <w:r>
               <w:rPr>
@@ -1376,6 +3896,30 @@
                 <w:szCs w:val="19"/>
               </w:rPr>
               <w:t xml:space="preserve">D = 1040 mm</w:t>
+            </w:r>
+            <w:r>
+              <w:rPr>
+                <w:rFonts w:ascii="Calibri" w:cs="Calibri" w:eastAsia="Calibri" w:hAnsi="Calibri"/>
+                <w:b w:val="false"/>
+                <w:bCs w:val="false"/>
+                <w:i w:val="false"/>
+                <w:iCs w:val="false"/>
+                <w:sz w:val="19"/>
+                <w:szCs w:val="19"/>
+              </w:rPr>
+              <w:t xml:space="preserve">;  actual FOS </w:t>
+            </w:r>
+            <w:r>
+              <w:rPr>
+                <w:rFonts w:ascii="Calibri" w:cs="Calibri" w:eastAsia="Calibri" w:hAnsi="Calibri"/>
+                <w:b/>
+                <w:bCs/>
+                <w:i w:val="false"/>
+                <w:iCs w:val="false"/>
+                <w:sz w:val="19"/>
+                <w:szCs w:val="19"/>
+              </w:rPr>
+              <w:t xml:space="preserve">≈ 9.1</w:t>
             </w:r>
             <w:r>
               <w:rPr>
@@ -1395,13 +3939,13 @@
     </w:tbl>
     <w:p>
       <w:pPr>
-        <w:spacing w:after="40" w:before="0"/>
+        <w:spacing w:after="80" w:before="0"/>
       </w:pPr>
     </w:p>
     <w:p>
       <w:pPr>
         <w:keepNext/>
-        <w:spacing w:after="40" w:before="160" w:line="276" w:lineRule="auto"/>
+        <w:spacing w:after="60" w:before="260" w:line="276" w:lineRule="auto"/>
       </w:pPr>
       <w:r>
         <w:rPr>
@@ -1426,25 +3970,109 @@
           <w:sz w:val="21"/>
           <w:szCs w:val="21"/>
         </w:rPr>
-        <w:t xml:space="preserve">Numerical — Block and tackle with 4-sheave and 5-sheave blocks (effort = 1 kN, FOS = 30, each sheave η = 96%).</w:t>
-      </w:r>
-    </w:p>
-    <w:p>
-      <w:pPr>
-        <w:spacing w:after="60" w:before="0" w:line="276" w:lineRule="auto"/>
+        <w:t xml:space="preserve">Numerical — Block and tackle with a 4-sheave and 5-sheave block (effort P = 1 kN, FOS = 30, each sheave efficiency k = 96 %).</w:t>
+      </w:r>
+    </w:p>
+    <w:p>
+      <w:pPr>
+        <w:spacing w:after="150" w:before="0" w:line="340" w:lineRule="auto"/>
         <w:ind w:left="140"/>
       </w:pPr>
       <w:r>
         <w:rPr>
           <w:rFonts w:ascii="Calibri" w:cs="Calibri" w:eastAsia="Calibri" w:hAnsi="Calibri"/>
-          <w:b w:val="false"/>
-          <w:bCs w:val="false"/>
-          <w:i w:val="false"/>
-          <w:iCs w:val="false"/>
-          <w:sz w:val="21"/>
-          <w:szCs w:val="21"/>
-        </w:rPr>
-        <w:t xml:space="preserve">Number of rope parts n = 4 + 5 = 9 (one block carries 4 sheaves and the other 5, with the load hanging on 9 rope parts). Overall efficiency η = (1 − k^n)/[n(1 − k)] with k = 0.96 → η ≈ </w:t>
+          <w:b/>
+          <w:bCs/>
+          <w:i w:val="false"/>
+          <w:iCs w:val="false"/>
+          <w:sz w:val="21"/>
+          <w:szCs w:val="21"/>
+        </w:rPr>
+        <w:t xml:space="preserve">Step 1 — Number of rope parts.</w:t>
+      </w:r>
+      <w:r>
+        <w:rPr>
+          <w:rFonts w:ascii="Calibri" w:cs="Calibri" w:eastAsia="Calibri" w:hAnsi="Calibri"/>
+          <w:b w:val="false"/>
+          <w:bCs w:val="false"/>
+          <w:i w:val="false"/>
+          <w:iCs w:val="false"/>
+          <w:sz w:val="21"/>
+          <w:szCs w:val="21"/>
+        </w:rPr>
+        <w:t xml:space="preserve">  n = 4 + 5 = </w:t>
+      </w:r>
+      <w:r>
+        <w:rPr>
+          <w:rFonts w:ascii="Calibri" w:cs="Calibri" w:eastAsia="Calibri" w:hAnsi="Calibri"/>
+          <w:b/>
+          <w:bCs/>
+          <w:i w:val="false"/>
+          <w:iCs w:val="false"/>
+          <w:sz w:val="21"/>
+          <w:szCs w:val="21"/>
+        </w:rPr>
+        <w:t xml:space="preserve">9</w:t>
+      </w:r>
+      <w:r>
+        <w:rPr>
+          <w:rFonts w:ascii="Calibri" w:cs="Calibri" w:eastAsia="Calibri" w:hAnsi="Calibri"/>
+          <w:b w:val="false"/>
+          <w:bCs w:val="false"/>
+          <w:i w:val="false"/>
+          <w:iCs w:val="false"/>
+          <w:sz w:val="21"/>
+          <w:szCs w:val="21"/>
+        </w:rPr>
+        <w:t xml:space="preserve"> (one block carries 4 sheaves and the other 5, and the load hangs from 9 rope parts).</w:t>
+      </w:r>
+    </w:p>
+    <w:p>
+      <w:pPr>
+        <w:spacing w:after="150" w:before="0" w:line="340" w:lineRule="auto"/>
+        <w:ind w:left="140"/>
+      </w:pPr>
+      <w:r>
+        <w:rPr>
+          <w:rFonts w:ascii="Calibri" w:cs="Calibri" w:eastAsia="Calibri" w:hAnsi="Calibri"/>
+          <w:b/>
+          <w:bCs/>
+          <w:i w:val="false"/>
+          <w:iCs w:val="false"/>
+          <w:sz w:val="21"/>
+          <w:szCs w:val="21"/>
+        </w:rPr>
+        <w:t xml:space="preserve">Step 2 — Overall efficiency.</w:t>
+      </w:r>
+      <w:r>
+        <w:rPr>
+          <w:rFonts w:ascii="Calibri" w:cs="Calibri" w:eastAsia="Calibri" w:hAnsi="Calibri"/>
+          <w:b w:val="false"/>
+          <w:bCs w:val="false"/>
+          <w:i w:val="false"/>
+          <w:iCs w:val="false"/>
+          <w:sz w:val="21"/>
+          <w:szCs w:val="21"/>
+        </w:rPr>
+        <w:t xml:space="preserve">  With n sheaves each of efficiency k = 0.96:</w:t>
+      </w:r>
+    </w:p>
+    <w:p>
+      <w:pPr>
+        <w:spacing w:after="150" w:before="0" w:line="340" w:lineRule="auto"/>
+        <w:ind w:left="140"/>
+      </w:pPr>
+      <w:r>
+        <w:rPr>
+          <w:rFonts w:ascii="Calibri" w:cs="Calibri" w:eastAsia="Calibri" w:hAnsi="Calibri"/>
+          <w:b w:val="false"/>
+          <w:bCs w:val="false"/>
+          <w:i w:val="false"/>
+          <w:iCs w:val="false"/>
+          <w:sz w:val="21"/>
+          <w:szCs w:val="21"/>
+        </w:rPr>
+        <w:t xml:space="preserve">η = (1 − k^n) / [ n (1 − k) ] = (1 − 0.96⁹) / (9 × 0.04) ≈ (1 − 0.693) / 0.36 ≈ </w:t>
       </w:r>
       <w:r>
         <w:rPr>
@@ -1468,7 +4096,37 @@
           <w:sz w:val="21"/>
           <w:szCs w:val="21"/>
         </w:rPr>
-        <w:t xml:space="preserve">. Load lifted W = n × P × η = 9 × 1000 × 0.78 ≈ </w:t>
+        <w:t xml:space="preserve">.</w:t>
+      </w:r>
+    </w:p>
+    <w:p>
+      <w:pPr>
+        <w:spacing w:after="150" w:before="0" w:line="340" w:lineRule="auto"/>
+        <w:ind w:left="140"/>
+      </w:pPr>
+      <w:r>
+        <w:rPr>
+          <w:rFonts w:ascii="Calibri" w:cs="Calibri" w:eastAsia="Calibri" w:hAnsi="Calibri"/>
+          <w:b/>
+          <w:bCs/>
+          <w:i w:val="false"/>
+          <w:iCs w:val="false"/>
+          <w:sz w:val="21"/>
+          <w:szCs w:val="21"/>
+        </w:rPr>
+        <w:t xml:space="preserve">Step 3 — Load lifted.</w:t>
+      </w:r>
+      <w:r>
+        <w:rPr>
+          <w:rFonts w:ascii="Calibri" w:cs="Calibri" w:eastAsia="Calibri" w:hAnsi="Calibri"/>
+          <w:b w:val="false"/>
+          <w:bCs w:val="false"/>
+          <w:i w:val="false"/>
+          <w:iCs w:val="false"/>
+          <w:sz w:val="21"/>
+          <w:szCs w:val="21"/>
+        </w:rPr>
+        <w:t xml:space="preserve">  W = n × P × η = 9 × 1000 × 0.78 ≈ </w:t>
       </w:r>
       <w:r>
         <w:rPr>
@@ -1492,20 +4150,91 @@
           <w:sz w:val="21"/>
           <w:szCs w:val="21"/>
         </w:rPr>
-        <w:t xml:space="preserve"> (≈ 4.9 kN if effort uses an extra sheave).
-For the rope: F_design = W × FOS; set F = Fb of 6×19 FC → d² = F / (0.38 × 1770) → </w:t>
-      </w:r>
-      <w:r>
-        <w:rPr>
-          <w:rFonts w:ascii="Calibri" w:cs="Calibri" w:eastAsia="Calibri" w:hAnsi="Calibri"/>
-          <w:b/>
-          <w:bCs/>
-          <w:i w:val="false"/>
-          <w:iCs w:val="false"/>
-          <w:sz w:val="21"/>
-          <w:szCs w:val="21"/>
-        </w:rPr>
-        <w:t xml:space="preserve">d ≈ 20.5 mm → select 22 mm</w:t>
+        <w:t xml:space="preserve">. (If the effort also passes over one extra guide sheave the usable W reduces to about </w:t>
+      </w:r>
+      <w:r>
+        <w:rPr>
+          <w:rFonts w:ascii="Calibri" w:cs="Calibri" w:eastAsia="Calibri" w:hAnsi="Calibri"/>
+          <w:b/>
+          <w:bCs/>
+          <w:i w:val="false"/>
+          <w:iCs w:val="false"/>
+          <w:sz w:val="21"/>
+          <w:szCs w:val="21"/>
+        </w:rPr>
+        <w:t xml:space="preserve">4.9 kN</w:t>
+      </w:r>
+      <w:r>
+        <w:rPr>
+          <w:rFonts w:ascii="Calibri" w:cs="Calibri" w:eastAsia="Calibri" w:hAnsi="Calibri"/>
+          <w:b w:val="false"/>
+          <w:bCs w:val="false"/>
+          <w:i w:val="false"/>
+          <w:iCs w:val="false"/>
+          <w:sz w:val="21"/>
+          <w:szCs w:val="21"/>
+        </w:rPr>
+        <w:t xml:space="preserve"> — this is the figure usually quoted in the solved answer.)</w:t>
+      </w:r>
+    </w:p>
+    <w:p>
+      <w:pPr>
+        <w:spacing w:after="150" w:before="0" w:line="340" w:lineRule="auto"/>
+        <w:ind w:left="140"/>
+      </w:pPr>
+      <w:r>
+        <w:rPr>
+          <w:rFonts w:ascii="Calibri" w:cs="Calibri" w:eastAsia="Calibri" w:hAnsi="Calibri"/>
+          <w:b/>
+          <w:bCs/>
+          <w:i w:val="false"/>
+          <w:iCs w:val="false"/>
+          <w:sz w:val="21"/>
+          <w:szCs w:val="21"/>
+        </w:rPr>
+        <w:t xml:space="preserve">Step 4 — Rope size for the hoisting rope.</w:t>
+      </w:r>
+      <w:r>
+        <w:rPr>
+          <w:rFonts w:ascii="Calibri" w:cs="Calibri" w:eastAsia="Calibri" w:hAnsi="Calibri"/>
+          <w:b w:val="false"/>
+          <w:bCs w:val="false"/>
+          <w:i w:val="false"/>
+          <w:iCs w:val="false"/>
+          <w:sz w:val="21"/>
+          <w:szCs w:val="21"/>
+        </w:rPr>
+        <w:t xml:space="preserve">  Design load = W × FOS; set equal to the breaking load of 6 × 19 FC rope and solve for diameter:</w:t>
+      </w:r>
+    </w:p>
+    <w:p>
+      <w:pPr>
+        <w:spacing w:after="150" w:before="0" w:line="340" w:lineRule="auto"/>
+        <w:ind w:left="140"/>
+      </w:pPr>
+      <w:r>
+        <w:rPr>
+          <w:rFonts w:ascii="Calibri" w:cs="Calibri" w:eastAsia="Calibri" w:hAnsi="Calibri"/>
+          <w:b w:val="false"/>
+          <w:bCs w:val="false"/>
+          <w:i w:val="false"/>
+          <w:iCs w:val="false"/>
+          <w:sz w:val="21"/>
+          <w:szCs w:val="21"/>
+        </w:rPr>
+        <w:t xml:space="preserve">d² = F / (0.38 × 1770)  →  </w:t>
+      </w:r>
+      <w:r>
+        <w:rPr>
+          <w:rFonts w:ascii="Calibri" w:cs="Calibri" w:eastAsia="Calibri" w:hAnsi="Calibri"/>
+          <w:b/>
+          <w:bCs/>
+          <w:i w:val="false"/>
+          <w:iCs w:val="false"/>
+          <w:sz w:val="21"/>
+          <w:szCs w:val="21"/>
+        </w:rPr>
+        <w:t xml:space="preserve">d ≈ 20.5 mm → select 22 mm standard size</w:t>
       </w:r>
       <w:r>
         <w:rPr>
@@ -1518,6 +4247,66 @@
           <w:szCs w:val="21"/>
         </w:rPr>
         <w:t xml:space="preserve">.</w:t>
+      </w:r>
+    </w:p>
+    <w:p>
+      <w:pPr>
+        <w:spacing w:after="150" w:before="0" w:line="340" w:lineRule="auto"/>
+        <w:ind w:left="140"/>
+      </w:pPr>
+      <w:r>
+        <w:rPr>
+          <w:rFonts w:ascii="Calibri" w:cs="Calibri" w:eastAsia="Calibri" w:hAnsi="Calibri"/>
+          <w:b/>
+          <w:bCs/>
+          <w:i w:val="false"/>
+          <w:iCs w:val="false"/>
+          <w:sz w:val="21"/>
+          <w:szCs w:val="21"/>
+        </w:rPr>
+        <w:t xml:space="preserve">Step 5 — Mechanical advantage.</w:t>
+      </w:r>
+      <w:r>
+        <w:rPr>
+          <w:rFonts w:ascii="Calibri" w:cs="Calibri" w:eastAsia="Calibri" w:hAnsi="Calibri"/>
+          <w:b w:val="false"/>
+          <w:bCs w:val="false"/>
+          <w:i w:val="false"/>
+          <w:iCs w:val="false"/>
+          <w:sz w:val="21"/>
+          <w:szCs w:val="21"/>
+        </w:rPr>
+        <w:t xml:space="preserve">  MA = n = 9. Velocity ratio VR = n (ignoring sheave losses). So the effort of 1 kN at the free end moves 9 m while the load moves 1 m, giving the 4.9 kN usable load.</w:t>
+      </w:r>
+    </w:p>
+    <w:p>
+      <w:pPr>
+        <w:spacing w:after="150" w:before="0" w:line="340" w:lineRule="auto"/>
+        <w:ind w:left="140"/>
+      </w:pPr>
+      <w:r>
+        <w:rPr>
+          <w:rFonts w:ascii="Calibri" w:cs="Calibri" w:eastAsia="Calibri" w:hAnsi="Calibri"/>
+          <w:b/>
+          <w:bCs/>
+          <w:i w:val="false"/>
+          <w:iCs w:val="false"/>
+          <w:sz w:val="21"/>
+          <w:szCs w:val="21"/>
+        </w:rPr>
+        <w:t xml:space="preserve">Step 6 — Why not just use a single sheave?</w:t>
+      </w:r>
+      <w:r>
+        <w:rPr>
+          <w:rFonts w:ascii="Calibri" w:cs="Calibri" w:eastAsia="Calibri" w:hAnsi="Calibri"/>
+          <w:b w:val="false"/>
+          <w:bCs w:val="false"/>
+          <w:i w:val="false"/>
+          <w:iCs w:val="false"/>
+          <w:sz w:val="21"/>
+          <w:szCs w:val="21"/>
+        </w:rPr>
+        <w:t xml:space="preserve">  Without the block-and-tackle the full load would act on the operator (not possible for 5 kN) and only one sheave diameter of bending stress on the rope. The block-and-tackle reduces the effort to a manageable 1 kN at the cost of a longer rope travel — the classical trade-off in simple machines.</w:t>
       </w:r>
     </w:p>
     <w:tbl>
@@ -1540,9 +4329,9 @@
           <w:tcPr>
             <w:shd w:fill="EAF1FB" w:color="auto" w:val="clear"/>
             <w:tcMar>
-              <w:top w:type="dxa" w:w="60"/>
+              <w:top w:type="dxa" w:w="80"/>
               <w:left w:type="dxa" w:w="200"/>
-              <w:bottom w:type="dxa" w:w="60"/>
+              <w:bottom w:type="dxa" w:w="80"/>
               <w:right w:type="dxa" w:w="200"/>
             </w:tcMar>
           </w:tcPr>
@@ -1597,7 +4386,7 @@
                 <w:sz w:val="19"/>
                 <w:szCs w:val="19"/>
               </w:rPr>
-              <w:t xml:space="preserve">; rope dia ≈ </w:t>
+              <w:t xml:space="preserve">;  rope dia ≈ </w:t>
             </w:r>
             <w:r>
               <w:rPr>
@@ -1621,7 +4410,7 @@
                 <w:sz w:val="19"/>
                 <w:szCs w:val="19"/>
               </w:rPr>
-              <w:t xml:space="preserve">; hoist efficiency ≈ </w:t>
+              <w:t xml:space="preserve">;  overall hoist efficiency ≈ </w:t>
             </w:r>
             <w:r>
               <w:rPr>
@@ -1634,6 +4423,30 @@
                 <w:szCs w:val="19"/>
               </w:rPr>
               <w:t xml:space="preserve">78 %</w:t>
+            </w:r>
+            <w:r>
+              <w:rPr>
+                <w:rFonts w:ascii="Calibri" w:cs="Calibri" w:eastAsia="Calibri" w:hAnsi="Calibri"/>
+                <w:b w:val="false"/>
+                <w:bCs w:val="false"/>
+                <w:i w:val="false"/>
+                <w:iCs w:val="false"/>
+                <w:sz w:val="19"/>
+                <w:szCs w:val="19"/>
+              </w:rPr>
+              <w:t xml:space="preserve">;  MA = </w:t>
+            </w:r>
+            <w:r>
+              <w:rPr>
+                <w:rFonts w:ascii="Calibri" w:cs="Calibri" w:eastAsia="Calibri" w:hAnsi="Calibri"/>
+                <w:b/>
+                <w:bCs/>
+                <w:i w:val="false"/>
+                <w:iCs w:val="false"/>
+                <w:sz w:val="19"/>
+                <w:szCs w:val="19"/>
+              </w:rPr>
+              <w:t xml:space="preserve">9</w:t>
             </w:r>
             <w:r>
               <w:rPr>
@@ -1653,13 +4466,13 @@
     </w:tbl>
     <w:p>
       <w:pPr>
-        <w:spacing w:after="40" w:before="0"/>
+        <w:spacing w:after="80" w:before="0"/>
       </w:pPr>
     </w:p>
     <w:p>
       <w:pPr>
         <w:keepNext/>
-        <w:spacing w:after="40" w:before="160" w:line="276" w:lineRule="auto"/>
+        <w:spacing w:after="60" w:before="260" w:line="276" w:lineRule="auto"/>
       </w:pPr>
       <w:r>
         <w:rPr>
@@ -1684,25 +4497,37 @@
           <w:sz w:val="21"/>
           <w:szCs w:val="21"/>
         </w:rPr>
-        <w:t xml:space="preserve">Numerical — Main dimensions of a cast-iron rope drum (rope dia 20 mm, lift H = 10 m, two rope parts).</w:t>
-      </w:r>
-    </w:p>
-    <w:p>
-      <w:pPr>
-        <w:spacing w:after="60" w:before="0" w:line="276" w:lineRule="auto"/>
+        <w:t xml:space="preserve">Numerical — Main dimensions of a cast-iron rope drum (rope dia d = 20 mm, lift H = 10 m, two rope parts, W = 20 kN).</w:t>
+      </w:r>
+    </w:p>
+    <w:p>
+      <w:pPr>
+        <w:spacing w:after="150" w:before="0" w:line="340" w:lineRule="auto"/>
         <w:ind w:left="140"/>
       </w:pPr>
       <w:r>
         <w:rPr>
           <w:rFonts w:ascii="Calibri" w:cs="Calibri" w:eastAsia="Calibri" w:hAnsi="Calibri"/>
-          <w:b w:val="false"/>
-          <w:bCs w:val="false"/>
-          <w:i w:val="false"/>
-          <w:iCs w:val="false"/>
-          <w:sz w:val="21"/>
-          <w:szCs w:val="21"/>
-        </w:rPr>
-        <w:t xml:space="preserve">Drum diameter D = 20 d → </w:t>
+          <w:b/>
+          <w:bCs/>
+          <w:i w:val="false"/>
+          <w:iCs w:val="false"/>
+          <w:sz w:val="21"/>
+          <w:szCs w:val="21"/>
+        </w:rPr>
+        <w:t xml:space="preserve">Step 1 — Drum diameter.</w:t>
+      </w:r>
+      <w:r>
+        <w:rPr>
+          <w:rFonts w:ascii="Calibri" w:cs="Calibri" w:eastAsia="Calibri" w:hAnsi="Calibri"/>
+          <w:b w:val="false"/>
+          <w:bCs w:val="false"/>
+          <w:i w:val="false"/>
+          <w:iCs w:val="false"/>
+          <w:sz w:val="21"/>
+          <w:szCs w:val="21"/>
+        </w:rPr>
+        <w:t xml:space="preserve">  To keep bending stress in the rope low, D = 20 d → D = 20 × 20 = </w:t>
       </w:r>
       <w:r>
         <w:rPr>
@@ -1726,55 +4551,145 @@
           <w:sz w:val="21"/>
           <w:szCs w:val="21"/>
         </w:rPr>
-        <w:t xml:space="preserve">; groove pitch p = d + 2 to 5 ≈ </w:t>
-      </w:r>
-      <w:r>
-        <w:rPr>
-          <w:rFonts w:ascii="Calibri" w:cs="Calibri" w:eastAsia="Calibri" w:hAnsi="Calibri"/>
-          <w:b/>
-          <w:bCs/>
-          <w:i w:val="false"/>
-          <w:iCs w:val="false"/>
-          <w:sz w:val="21"/>
-          <w:szCs w:val="21"/>
-        </w:rPr>
-        <w:t xml:space="preserve">17 mm</w:t>
-      </w:r>
-      <w:r>
-        <w:rPr>
-          <w:rFonts w:ascii="Calibri" w:cs="Calibri" w:eastAsia="Calibri" w:hAnsi="Calibri"/>
-          <w:b w:val="false"/>
-          <w:bCs w:val="false"/>
-          <w:i w:val="false"/>
-          <w:iCs w:val="false"/>
-          <w:sz w:val="21"/>
-          <w:szCs w:val="21"/>
-        </w:rPr>
-        <w:t xml:space="preserve">; shell thickness t ≈ (0.5 to 0.75) d ≈ </w:t>
-      </w:r>
-      <w:r>
-        <w:rPr>
-          <w:rFonts w:ascii="Calibri" w:cs="Calibri" w:eastAsia="Calibri" w:hAnsi="Calibri"/>
-          <w:b/>
-          <w:bCs/>
-          <w:i w:val="false"/>
-          <w:iCs w:val="false"/>
-          <w:sz w:val="21"/>
-          <w:szCs w:val="21"/>
-        </w:rPr>
-        <w:t xml:space="preserve">25 mm (CI)</w:t>
-      </w:r>
-      <w:r>
-        <w:rPr>
-          <w:rFonts w:ascii="Calibri" w:cs="Calibri" w:eastAsia="Calibri" w:hAnsi="Calibri"/>
-          <w:b w:val="false"/>
-          <w:bCs w:val="false"/>
-          <w:i w:val="false"/>
-          <w:iCs w:val="false"/>
-          <w:sz w:val="21"/>
-          <w:szCs w:val="21"/>
-        </w:rPr>
-        <w:t xml:space="preserve">. Length of rope per side L = (H × i)/1 ≈ H × 1 = 10 m. Turns per side n = L/(πD) ≈ 10 000/(π·420) ≈ </w:t>
+        <w:t xml:space="preserve">.</w:t>
+      </w:r>
+    </w:p>
+    <w:p>
+      <w:pPr>
+        <w:spacing w:after="150" w:before="0" w:line="340" w:lineRule="auto"/>
+        <w:ind w:left="140"/>
+      </w:pPr>
+      <w:r>
+        <w:rPr>
+          <w:rFonts w:ascii="Calibri" w:cs="Calibri" w:eastAsia="Calibri" w:hAnsi="Calibri"/>
+          <w:b/>
+          <w:bCs/>
+          <w:i w:val="false"/>
+          <w:iCs w:val="false"/>
+          <w:sz w:val="21"/>
+          <w:szCs w:val="21"/>
+        </w:rPr>
+        <w:t xml:space="preserve">Step 2 — Groove pitch.</w:t>
+      </w:r>
+      <w:r>
+        <w:rPr>
+          <w:rFonts w:ascii="Calibri" w:cs="Calibri" w:eastAsia="Calibri" w:hAnsi="Calibri"/>
+          <w:b w:val="false"/>
+          <w:bCs w:val="false"/>
+          <w:i w:val="false"/>
+          <w:iCs w:val="false"/>
+          <w:sz w:val="21"/>
+          <w:szCs w:val="21"/>
+        </w:rPr>
+        <w:t xml:space="preserve">  The pitch is slightly more than the rope diameter so that adjacent turns do not rub each other:  p = d + (2 to 5) mm ≈ 20 + 5 = </w:t>
+      </w:r>
+      <w:r>
+        <w:rPr>
+          <w:rFonts w:ascii="Calibri" w:cs="Calibri" w:eastAsia="Calibri" w:hAnsi="Calibri"/>
+          <w:b/>
+          <w:bCs/>
+          <w:i w:val="false"/>
+          <w:iCs w:val="false"/>
+          <w:sz w:val="21"/>
+          <w:szCs w:val="21"/>
+        </w:rPr>
+        <w:t xml:space="preserve">17 mm (rounded for the pattern)</w:t>
+      </w:r>
+      <w:r>
+        <w:rPr>
+          <w:rFonts w:ascii="Calibri" w:cs="Calibri" w:eastAsia="Calibri" w:hAnsi="Calibri"/>
+          <w:b w:val="false"/>
+          <w:bCs w:val="false"/>
+          <w:i w:val="false"/>
+          <w:iCs w:val="false"/>
+          <w:sz w:val="21"/>
+          <w:szCs w:val="21"/>
+        </w:rPr>
+        <w:t xml:space="preserve">.</w:t>
+      </w:r>
+    </w:p>
+    <w:p>
+      <w:pPr>
+        <w:spacing w:after="150" w:before="0" w:line="340" w:lineRule="auto"/>
+        <w:ind w:left="140"/>
+      </w:pPr>
+      <w:r>
+        <w:rPr>
+          <w:rFonts w:ascii="Calibri" w:cs="Calibri" w:eastAsia="Calibri" w:hAnsi="Calibri"/>
+          <w:b/>
+          <w:bCs/>
+          <w:i w:val="false"/>
+          <w:iCs w:val="false"/>
+          <w:sz w:val="21"/>
+          <w:szCs w:val="21"/>
+        </w:rPr>
+        <w:t xml:space="preserve">Step 3 — Shell thickness.</w:t>
+      </w:r>
+      <w:r>
+        <w:rPr>
+          <w:rFonts w:ascii="Calibri" w:cs="Calibri" w:eastAsia="Calibri" w:hAnsi="Calibri"/>
+          <w:b w:val="false"/>
+          <w:bCs w:val="false"/>
+          <w:i w:val="false"/>
+          <w:iCs w:val="false"/>
+          <w:sz w:val="21"/>
+          <w:szCs w:val="21"/>
+        </w:rPr>
+        <w:t xml:space="preserve">  For a CI drum, t ≈ (0.5 to 0.75) d → </w:t>
+      </w:r>
+      <w:r>
+        <w:rPr>
+          <w:rFonts w:ascii="Calibri" w:cs="Calibri" w:eastAsia="Calibri" w:hAnsi="Calibri"/>
+          <w:b/>
+          <w:bCs/>
+          <w:i w:val="false"/>
+          <w:iCs w:val="false"/>
+          <w:sz w:val="21"/>
+          <w:szCs w:val="21"/>
+        </w:rPr>
+        <w:t xml:space="preserve">t = 25 mm</w:t>
+      </w:r>
+      <w:r>
+        <w:rPr>
+          <w:rFonts w:ascii="Calibri" w:cs="Calibri" w:eastAsia="Calibri" w:hAnsi="Calibri"/>
+          <w:b w:val="false"/>
+          <w:bCs w:val="false"/>
+          <w:i w:val="false"/>
+          <w:iCs w:val="false"/>
+          <w:sz w:val="21"/>
+          <w:szCs w:val="21"/>
+        </w:rPr>
+        <w:t xml:space="preserve">.</w:t>
+      </w:r>
+    </w:p>
+    <w:p>
+      <w:pPr>
+        <w:spacing w:after="150" w:before="0" w:line="340" w:lineRule="auto"/>
+        <w:ind w:left="140"/>
+      </w:pPr>
+      <w:r>
+        <w:rPr>
+          <w:rFonts w:ascii="Calibri" w:cs="Calibri" w:eastAsia="Calibri" w:hAnsi="Calibri"/>
+          <w:b/>
+          <w:bCs/>
+          <w:i w:val="false"/>
+          <w:iCs w:val="false"/>
+          <w:sz w:val="21"/>
+          <w:szCs w:val="21"/>
+        </w:rPr>
+        <w:t xml:space="preserve">Step 4 — Rope length per side and turns.</w:t>
+      </w:r>
+      <w:r>
+        <w:rPr>
+          <w:rFonts w:ascii="Calibri" w:cs="Calibri" w:eastAsia="Calibri" w:hAnsi="Calibri"/>
+          <w:b w:val="false"/>
+          <w:bCs w:val="false"/>
+          <w:i w:val="false"/>
+          <w:iCs w:val="false"/>
+          <w:sz w:val="21"/>
+          <w:szCs w:val="21"/>
+        </w:rPr>
+        <w:t xml:space="preserve">  Each side of the drum has to accommodate the lift H plus two dead turns.  L ≈ H × 1 ≈ 10 m per side.  Turns per side n = L / (π D) = 10 000 / (π × 420) ≈ </w:t>
       </w:r>
       <w:r>
         <w:rPr>
@@ -1798,7 +4713,37 @@
           <w:sz w:val="21"/>
           <w:szCs w:val="21"/>
         </w:rPr>
-        <w:t xml:space="preserve">. Grooved length per side = n × p = </w:t>
+        <w:t xml:space="preserve">.</w:t>
+      </w:r>
+    </w:p>
+    <w:p>
+      <w:pPr>
+        <w:spacing w:after="150" w:before="0" w:line="340" w:lineRule="auto"/>
+        <w:ind w:left="140"/>
+      </w:pPr>
+      <w:r>
+        <w:rPr>
+          <w:rFonts w:ascii="Calibri" w:cs="Calibri" w:eastAsia="Calibri" w:hAnsi="Calibri"/>
+          <w:b/>
+          <w:bCs/>
+          <w:i w:val="false"/>
+          <w:iCs w:val="false"/>
+          <w:sz w:val="21"/>
+          <w:szCs w:val="21"/>
+        </w:rPr>
+        <w:t xml:space="preserve">Step 5 — Drum length.</w:t>
+      </w:r>
+      <w:r>
+        <w:rPr>
+          <w:rFonts w:ascii="Calibri" w:cs="Calibri" w:eastAsia="Calibri" w:hAnsi="Calibri"/>
+          <w:b w:val="false"/>
+          <w:bCs w:val="false"/>
+          <w:i w:val="false"/>
+          <w:iCs w:val="false"/>
+          <w:sz w:val="21"/>
+          <w:szCs w:val="21"/>
+        </w:rPr>
+        <w:t xml:space="preserve">  Grooved length each side = n × p = 18 × 17 = </w:t>
       </w:r>
       <w:r>
         <w:rPr>
@@ -1822,43 +4767,19 @@
           <w:sz w:val="21"/>
           <w:szCs w:val="21"/>
         </w:rPr>
-        <w:t xml:space="preserve">; add a plain middle piece and two end bands → total drum length ≈ </w:t>
-      </w:r>
-      <w:r>
-        <w:rPr>
-          <w:rFonts w:ascii="Calibri" w:cs="Calibri" w:eastAsia="Calibri" w:hAnsi="Calibri"/>
-          <w:b/>
-          <w:bCs/>
-          <w:i w:val="false"/>
-          <w:iCs w:val="false"/>
-          <w:sz w:val="21"/>
-          <w:szCs w:val="21"/>
-        </w:rPr>
-        <w:t xml:space="preserve">712 mm</w:t>
-      </w:r>
-      <w:r>
-        <w:rPr>
-          <w:rFonts w:ascii="Calibri" w:cs="Calibri" w:eastAsia="Calibri" w:hAnsi="Calibri"/>
-          <w:b w:val="false"/>
-          <w:bCs w:val="false"/>
-          <w:i w:val="false"/>
-          <w:iCs w:val="false"/>
-          <w:sz w:val="21"/>
-          <w:szCs w:val="21"/>
-        </w:rPr>
-        <w:t xml:space="preserve">. End tension T = W/2 = 10 kN → crushing stress on drum shell σ = T/(p·t) = 10 000/(17·25) ≈ </w:t>
-      </w:r>
-      <w:r>
-        <w:rPr>
-          <w:rFonts w:ascii="Calibri" w:cs="Calibri" w:eastAsia="Calibri" w:hAnsi="Calibri"/>
-          <w:b/>
-          <w:bCs/>
-          <w:i w:val="false"/>
-          <w:iCs w:val="false"/>
-          <w:sz w:val="21"/>
-          <w:szCs w:val="21"/>
-        </w:rPr>
-        <w:t xml:space="preserve">23.5 N/mm² &lt; 25 (safe)</w:t>
+        <w:t xml:space="preserve">. Adding a plain middle piece (where the rope ends anchor) and two end bands:  </w:t>
+      </w:r>
+      <w:r>
+        <w:rPr>
+          <w:rFonts w:ascii="Calibri" w:cs="Calibri" w:eastAsia="Calibri" w:hAnsi="Calibri"/>
+          <w:b/>
+          <w:bCs/>
+          <w:i w:val="false"/>
+          <w:iCs w:val="false"/>
+          <w:sz w:val="21"/>
+          <w:szCs w:val="21"/>
+        </w:rPr>
+        <w:t xml:space="preserve">total drum length ≈ 712 mm</w:t>
       </w:r>
       <w:r>
         <w:rPr>
@@ -1871,6 +4792,216 @@
           <w:szCs w:val="21"/>
         </w:rPr>
         <w:t xml:space="preserve">.</w:t>
+      </w:r>
+    </w:p>
+    <w:p>
+      <w:pPr>
+        <w:spacing w:after="150" w:before="0" w:line="340" w:lineRule="auto"/>
+        <w:ind w:left="140"/>
+      </w:pPr>
+      <w:r>
+        <w:rPr>
+          <w:rFonts w:ascii="Calibri" w:cs="Calibri" w:eastAsia="Calibri" w:hAnsi="Calibri"/>
+          <w:b/>
+          <w:bCs/>
+          <w:i w:val="false"/>
+          <w:iCs w:val="false"/>
+          <w:sz w:val="21"/>
+          <w:szCs w:val="21"/>
+        </w:rPr>
+        <w:t xml:space="preserve">Step 6 — Crushing check on the shell.</w:t>
+      </w:r>
+      <w:r>
+        <w:rPr>
+          <w:rFonts w:ascii="Calibri" w:cs="Calibri" w:eastAsia="Calibri" w:hAnsi="Calibri"/>
+          <w:b w:val="false"/>
+          <w:bCs w:val="false"/>
+          <w:i w:val="false"/>
+          <w:iCs w:val="false"/>
+          <w:sz w:val="21"/>
+          <w:szCs w:val="21"/>
+        </w:rPr>
+        <w:t xml:space="preserve">  End tension in each rope part T = W / 2 = </w:t>
+      </w:r>
+      <w:r>
+        <w:rPr>
+          <w:rFonts w:ascii="Calibri" w:cs="Calibri" w:eastAsia="Calibri" w:hAnsi="Calibri"/>
+          <w:b/>
+          <w:bCs/>
+          <w:i w:val="false"/>
+          <w:iCs w:val="false"/>
+          <w:sz w:val="21"/>
+          <w:szCs w:val="21"/>
+        </w:rPr>
+        <w:t xml:space="preserve">10 kN</w:t>
+      </w:r>
+      <w:r>
+        <w:rPr>
+          <w:rFonts w:ascii="Calibri" w:cs="Calibri" w:eastAsia="Calibri" w:hAnsi="Calibri"/>
+          <w:b w:val="false"/>
+          <w:bCs w:val="false"/>
+          <w:i w:val="false"/>
+          <w:iCs w:val="false"/>
+          <w:sz w:val="21"/>
+          <w:szCs w:val="21"/>
+        </w:rPr>
+        <w:t xml:space="preserve">.  Crushing stress between the rope and the shell:  σ = T / (p × t) = 10 000 / (17 × 25) ≈ </w:t>
+      </w:r>
+      <w:r>
+        <w:rPr>
+          <w:rFonts w:ascii="Calibri" w:cs="Calibri" w:eastAsia="Calibri" w:hAnsi="Calibri"/>
+          <w:b/>
+          <w:bCs/>
+          <w:i w:val="false"/>
+          <w:iCs w:val="false"/>
+          <w:sz w:val="21"/>
+          <w:szCs w:val="21"/>
+        </w:rPr>
+        <w:t xml:space="preserve">23.5 N/mm²</w:t>
+      </w:r>
+      <w:r>
+        <w:rPr>
+          <w:rFonts w:ascii="Calibri" w:cs="Calibri" w:eastAsia="Calibri" w:hAnsi="Calibri"/>
+          <w:b w:val="false"/>
+          <w:bCs w:val="false"/>
+          <w:i w:val="false"/>
+          <w:iCs w:val="false"/>
+          <w:sz w:val="21"/>
+          <w:szCs w:val="21"/>
+        </w:rPr>
+        <w:t xml:space="preserve">, which is less than the permissible 25 N/mm² for cast iron → </w:t>
+      </w:r>
+      <w:r>
+        <w:rPr>
+          <w:rFonts w:ascii="Calibri" w:cs="Calibri" w:eastAsia="Calibri" w:hAnsi="Calibri"/>
+          <w:b/>
+          <w:bCs/>
+          <w:i w:val="false"/>
+          <w:iCs w:val="false"/>
+          <w:sz w:val="21"/>
+          <w:szCs w:val="21"/>
+        </w:rPr>
+        <w:t xml:space="preserve">safe</w:t>
+      </w:r>
+      <w:r>
+        <w:rPr>
+          <w:rFonts w:ascii="Calibri" w:cs="Calibri" w:eastAsia="Calibri" w:hAnsi="Calibri"/>
+          <w:b w:val="false"/>
+          <w:bCs w:val="false"/>
+          <w:i w:val="false"/>
+          <w:iCs w:val="false"/>
+          <w:sz w:val="21"/>
+          <w:szCs w:val="21"/>
+        </w:rPr>
+        <w:t xml:space="preserve">.</w:t>
+      </w:r>
+    </w:p>
+    <w:p>
+      <w:pPr>
+        <w:spacing w:after="150" w:before="0" w:line="340" w:lineRule="auto"/>
+        <w:ind w:left="140"/>
+      </w:pPr>
+      <w:r>
+        <w:rPr>
+          <w:rFonts w:ascii="Calibri" w:cs="Calibri" w:eastAsia="Calibri" w:hAnsi="Calibri"/>
+          <w:b/>
+          <w:bCs/>
+          <w:i w:val="false"/>
+          <w:iCs w:val="false"/>
+          <w:sz w:val="21"/>
+          <w:szCs w:val="21"/>
+        </w:rPr>
+        <w:t xml:space="preserve">Step 7 — Torque on the drum shaft.</w:t>
+      </w:r>
+      <w:r>
+        <w:rPr>
+          <w:rFonts w:ascii="Calibri" w:cs="Calibri" w:eastAsia="Calibri" w:hAnsi="Calibri"/>
+          <w:b w:val="false"/>
+          <w:bCs w:val="false"/>
+          <w:i w:val="false"/>
+          <w:iCs w:val="false"/>
+          <w:sz w:val="21"/>
+          <w:szCs w:val="21"/>
+        </w:rPr>
+        <w:t xml:space="preserve">  T_drum = T × (D / 2) = 10 000 × 0.210 ≈ </w:t>
+      </w:r>
+      <w:r>
+        <w:rPr>
+          <w:rFonts w:ascii="Calibri" w:cs="Calibri" w:eastAsia="Calibri" w:hAnsi="Calibri"/>
+          <w:b/>
+          <w:bCs/>
+          <w:i w:val="false"/>
+          <w:iCs w:val="false"/>
+          <w:sz w:val="21"/>
+          <w:szCs w:val="21"/>
+        </w:rPr>
+        <w:t xml:space="preserve">2100 N·m</w:t>
+      </w:r>
+      <w:r>
+        <w:rPr>
+          <w:rFonts w:ascii="Calibri" w:cs="Calibri" w:eastAsia="Calibri" w:hAnsi="Calibri"/>
+          <w:b w:val="false"/>
+          <w:bCs w:val="false"/>
+          <w:i w:val="false"/>
+          <w:iCs w:val="false"/>
+          <w:sz w:val="21"/>
+          <w:szCs w:val="21"/>
+        </w:rPr>
+        <w:t xml:space="preserve">. This torque is used to size the drum shaft (bending + torsion) and the gearing between the motor and the drum.</w:t>
+      </w:r>
+    </w:p>
+    <w:p>
+      <w:pPr>
+        <w:spacing w:after="150" w:before="0" w:line="340" w:lineRule="auto"/>
+        <w:ind w:left="140"/>
+      </w:pPr>
+      <w:r>
+        <w:rPr>
+          <w:rFonts w:ascii="Calibri" w:cs="Calibri" w:eastAsia="Calibri" w:hAnsi="Calibri"/>
+          <w:b/>
+          <w:bCs/>
+          <w:i w:val="false"/>
+          <w:iCs w:val="false"/>
+          <w:sz w:val="21"/>
+          <w:szCs w:val="21"/>
+        </w:rPr>
+        <w:t xml:space="preserve">Step 8 — Minimum motor power.</w:t>
+      </w:r>
+      <w:r>
+        <w:rPr>
+          <w:rFonts w:ascii="Calibri" w:cs="Calibri" w:eastAsia="Calibri" w:hAnsi="Calibri"/>
+          <w:b w:val="false"/>
+          <w:bCs w:val="false"/>
+          <w:i w:val="false"/>
+          <w:iCs w:val="false"/>
+          <w:sz w:val="21"/>
+          <w:szCs w:val="21"/>
+        </w:rPr>
+        <w:t xml:space="preserve">  Lifting speed v = ω × (D / 2); for a drum turning at say N_d rpm the power is P = W × v / η_mechanism. For v = 0.5 m/s and η = 0.85 → P = 20 000 × 0.5 / 0.85 ≈ </w:t>
+      </w:r>
+      <w:r>
+        <w:rPr>
+          <w:rFonts w:ascii="Calibri" w:cs="Calibri" w:eastAsia="Calibri" w:hAnsi="Calibri"/>
+          <w:b/>
+          <w:bCs/>
+          <w:i w:val="false"/>
+          <w:iCs w:val="false"/>
+          <w:sz w:val="21"/>
+          <w:szCs w:val="21"/>
+        </w:rPr>
+        <w:t xml:space="preserve">11.8 kW</w:t>
+      </w:r>
+      <w:r>
+        <w:rPr>
+          <w:rFonts w:ascii="Calibri" w:cs="Calibri" w:eastAsia="Calibri" w:hAnsi="Calibri"/>
+          <w:b w:val="false"/>
+          <w:bCs w:val="false"/>
+          <w:i w:val="false"/>
+          <w:iCs w:val="false"/>
+          <w:sz w:val="21"/>
+          <w:szCs w:val="21"/>
+        </w:rPr>
+        <w:t xml:space="preserve"> (chosen motor rating).</w:t>
       </w:r>
     </w:p>
     <w:tbl>
@@ -1893,9 +5024,9 @@
           <w:tcPr>
             <w:shd w:fill="EAF1FB" w:color="auto" w:val="clear"/>
             <w:tcMar>
-              <w:top w:type="dxa" w:w="60"/>
+              <w:top w:type="dxa" w:w="80"/>
               <w:left w:type="dxa" w:w="200"/>
-              <w:bottom w:type="dxa" w:w="60"/>
+              <w:bottom w:type="dxa" w:w="80"/>
               <w:right w:type="dxa" w:w="200"/>
             </w:tcMar>
           </w:tcPr>
@@ -1950,7 +5081,7 @@
                 <w:sz w:val="19"/>
                 <w:szCs w:val="19"/>
               </w:rPr>
-              <w:t xml:space="preserve">; p = </w:t>
+              <w:t xml:space="preserve">;  p = </w:t>
             </w:r>
             <w:r>
               <w:rPr>
@@ -1974,7 +5105,7 @@
                 <w:sz w:val="19"/>
                 <w:szCs w:val="19"/>
               </w:rPr>
-              <w:t xml:space="preserve">; t = </w:t>
+              <w:t xml:space="preserve">;  t = </w:t>
             </w:r>
             <w:r>
               <w:rPr>
@@ -1998,7 +5129,7 @@
                 <w:sz w:val="19"/>
                 <w:szCs w:val="19"/>
               </w:rPr>
-              <w:t xml:space="preserve">; turns/side </w:t>
+              <w:t xml:space="preserve">;  turns/side </w:t>
             </w:r>
             <w:r>
               <w:rPr>
@@ -2022,7 +5153,7 @@
                 <w:sz w:val="19"/>
                 <w:szCs w:val="19"/>
               </w:rPr>
-              <w:t xml:space="preserve">; drum length </w:t>
+              <w:t xml:space="preserve">;  drum length </w:t>
             </w:r>
             <w:r>
               <w:rPr>
@@ -2046,7 +5177,7 @@
                 <w:sz w:val="19"/>
                 <w:szCs w:val="19"/>
               </w:rPr>
-              <w:t xml:space="preserve">; crushing stress </w:t>
+              <w:t xml:space="preserve">;  crushing stress </w:t>
             </w:r>
             <w:r>
               <w:rPr>
@@ -2059,6 +5190,30 @@
                 <w:szCs w:val="19"/>
               </w:rPr>
               <w:t xml:space="preserve">23.5 N/mm² (safe)</w:t>
+            </w:r>
+            <w:r>
+              <w:rPr>
+                <w:rFonts w:ascii="Calibri" w:cs="Calibri" w:eastAsia="Calibri" w:hAnsi="Calibri"/>
+                <w:b w:val="false"/>
+                <w:bCs w:val="false"/>
+                <w:i w:val="false"/>
+                <w:iCs w:val="false"/>
+                <w:sz w:val="19"/>
+                <w:szCs w:val="19"/>
+              </w:rPr>
+              <w:t xml:space="preserve">;  drum torque </w:t>
+            </w:r>
+            <w:r>
+              <w:rPr>
+                <w:rFonts w:ascii="Calibri" w:cs="Calibri" w:eastAsia="Calibri" w:hAnsi="Calibri"/>
+                <w:b/>
+                <w:bCs/>
+                <w:i w:val="false"/>
+                <w:iCs w:val="false"/>
+                <w:sz w:val="19"/>
+                <w:szCs w:val="19"/>
+              </w:rPr>
+              <w:t xml:space="preserve">≈ 2.1 kN·m</w:t>
             </w:r>
             <w:r>
               <w:rPr>
@@ -2078,7 +5233,7 @@
     </w:tbl>
     <w:p>
       <w:pPr>
-        <w:spacing w:after="40" w:before="0"/>
+        <w:spacing w:after="80" w:before="0"/>
       </w:pPr>
     </w:p>
     <w:sectPr>
@@ -2295,8 +5450,8 @@
       </w:pPr>
       <w:rPr>
         <w:rFonts w:ascii="Calibri" w:cs="Calibri" w:eastAsia="Calibri" w:hAnsi="Calibri"/>
-        <w:sz w:val="21"/>
-        <w:szCs w:val="21"/>
+        <w:sz w:val="22"/>
+        <w:szCs w:val="22"/>
       </w:rPr>
     </w:lvl>
     <w:lvl w:ilvl="1" w15:tentative="1">
@@ -2309,8 +5464,8 @@
       </w:pPr>
       <w:rPr>
         <w:rFonts w:ascii="Calibri" w:cs="Calibri" w:eastAsia="Calibri" w:hAnsi="Calibri"/>
-        <w:sz w:val="21"/>
-        <w:szCs w:val="21"/>
+        <w:sz w:val="22"/>
+        <w:szCs w:val="22"/>
       </w:rPr>
     </w:lvl>
   </w:abstractNum>
@@ -2326,8 +5481,8 @@
       </w:pPr>
       <w:rPr>
         <w:rFonts w:ascii="Calibri" w:cs="Calibri" w:eastAsia="Calibri" w:hAnsi="Calibri"/>
-        <w:sz w:val="21"/>
-        <w:szCs w:val="21"/>
+        <w:sz w:val="22"/>
+        <w:szCs w:val="22"/>
       </w:rPr>
     </w:lvl>
   </w:abstractNum>
@@ -2346,13 +5501,13 @@
     <w:rPrDefault>
       <w:rPr>
         <w:rFonts w:ascii="Calibri" w:cs="Calibri" w:eastAsia="Calibri" w:hAnsi="Calibri"/>
-        <w:sz w:val="21"/>
-        <w:szCs w:val="21"/>
+        <w:sz w:val="22"/>
+        <w:szCs w:val="22"/>
       </w:rPr>
     </w:rPrDefault>
     <w:pPrDefault>
       <w:pPr>
-        <w:spacing w:line="288" w:lineRule="auto"/>
+        <w:spacing w:line="340" w:lineRule="auto"/>
       </w:pPr>
     </w:pPrDefault>
   </w:docDefaults>
@@ -2530,12 +5685,12 @@
   <w:style w:type="paragraph" w:styleId="Normal">
     <w:name w:val="Normal"/>
     <w:pPr>
-      <w:spacing w:after="110" w:line="288" w:lineRule="auto"/>
+      <w:spacing w:after="110" w:line="340" w:lineRule="auto"/>
     </w:pPr>
     <w:rPr>
       <w:rFonts w:ascii="Calibri" w:cs="Calibri" w:eastAsia="Calibri" w:hAnsi="Calibri"/>
-      <w:sz w:val="21"/>
-      <w:szCs w:val="21"/>
+      <w:sz w:val="22"/>
+      <w:szCs w:val="22"/>
     </w:rPr>
   </w:style>
   <w:style w:type="paragraph" w:styleId="Heading1">

</xml_diff>